<commit_message>
Add class recording links and sync Obsidian changes
- Added YouTube recording links (1/29, 2/03, 2/05, 2/12, 2/17, 2/19, 2/24, 2/26, 3/05)
- Fixed 2/19 activity label from Part 1 to Part 2
- Updated 3/12 content (replaced online class notice with video link)
- Added Slide URLs for Team 1, 2, 5, 7 presentations

Co-Authored-By: Claude Opus 4.6 <noreply@anthropic.com>
</commit_message>
<xml_diff>
--- a/Syllabus.docx
+++ b/Syllabus.docx
@@ -3439,7 +3439,7 @@
     </w:p>
     <w:bookmarkEnd w:id="48"/>
     <w:bookmarkEnd w:id="49"/>
-    <w:bookmarkStart w:id="118" w:name="course-agenda"/>
+    <w:bookmarkStart w:id="132" w:name="course-agenda"/>
     <w:p>
       <w:pPr>
         <w:pStyle w:val="Heading2"/>
@@ -4060,7 +4060,18 @@
             </w:pPr>
             <w:r>
               <w:t xml:space="preserve">1/29 Thu</w:t>
-            </w:r>
+              <w:br/>
+            </w:r>
+            <w:hyperlink r:id="rId62">
+              <w:r>
+                <w:rPr>
+                  <w:rStyle w:val="Hyperlink"/>
+                  <w:color w:val="0066CC"/>
+                  <w:u w:val="single"/>
+                </w:rPr>
+                <w:t xml:space="preserve">Recording</w:t>
+              </w:r>
+            </w:hyperlink>
           </w:p>
         </w:tc>
         <w:tc>
@@ -4081,7 +4092,7 @@
             <w:r>
               <w:t xml:space="preserve"> </w:t>
             </w:r>
-            <w:hyperlink r:id="rId62">
+            <w:hyperlink r:id="rId63">
               <w:r>
                 <w:rPr>
                   <w:rStyle w:val="Hyperlink"/>
@@ -4194,7 +4205,18 @@
             </w:pPr>
             <w:r>
               <w:t xml:space="preserve">2/03 Tue</w:t>
-            </w:r>
+              <w:br/>
+            </w:r>
+            <w:hyperlink r:id="rId64">
+              <w:r>
+                <w:rPr>
+                  <w:rStyle w:val="Hyperlink"/>
+                  <w:color w:val="0066CC"/>
+                  <w:u w:val="single"/>
+                </w:rPr>
+                <w:t xml:space="preserve">Recording</w:t>
+              </w:r>
+            </w:hyperlink>
           </w:p>
         </w:tc>
         <w:tc>
@@ -4215,7 +4237,7 @@
             <w:r>
               <w:t xml:space="preserve"> </w:t>
             </w:r>
-            <w:hyperlink r:id="rId63">
+            <w:hyperlink r:id="rId65">
               <w:r>
                 <w:rPr>
                   <w:rStyle w:val="Hyperlink"/>
@@ -4235,7 +4257,7 @@
             <w:r>
               <w:t xml:space="preserve"> </w:t>
             </w:r>
-            <w:hyperlink r:id="rId64">
+            <w:hyperlink r:id="rId66">
               <w:r>
                 <w:rPr>
                   <w:rStyle w:val="Hyperlink"/>
@@ -4272,7 +4294,7 @@
             <w:r>
               <w:t xml:space="preserve"> </w:t>
             </w:r>
-            <w:hyperlink r:id="rId65">
+            <w:hyperlink r:id="rId67">
               <w:r>
                 <w:rPr>
                   <w:rStyle w:val="Hyperlink"/>
@@ -4360,7 +4382,18 @@
             </w:pPr>
             <w:r>
               <w:t xml:space="preserve">2/05 Thu</w:t>
-            </w:r>
+              <w:br/>
+            </w:r>
+            <w:hyperlink r:id="rId68">
+              <w:r>
+                <w:rPr>
+                  <w:rStyle w:val="Hyperlink"/>
+                  <w:color w:val="0066CC"/>
+                  <w:u w:val="single"/>
+                </w:rPr>
+                <w:t xml:space="preserve">Recording</w:t>
+              </w:r>
+            </w:hyperlink>
           </w:p>
         </w:tc>
         <w:tc>
@@ -4381,7 +4414,7 @@
             <w:r>
               <w:t xml:space="preserve"> </w:t>
             </w:r>
-            <w:hyperlink r:id="rId66">
+            <w:hyperlink r:id="rId69">
               <w:r>
                 <w:rPr>
                   <w:rStyle w:val="Hyperlink"/>
@@ -4474,7 +4507,7 @@
             <w:r>
               <w:t xml:space="preserve"> </w:t>
             </w:r>
-            <w:hyperlink r:id="rId67">
+            <w:hyperlink r:id="rId70">
               <w:r>
                 <w:rPr>
                   <w:rStyle w:val="Hyperlink"/>
@@ -4494,7 +4527,7 @@
             <w:r>
               <w:t xml:space="preserve"> </w:t>
             </w:r>
-            <w:hyperlink r:id="rId68">
+            <w:hyperlink r:id="rId71">
               <w:r>
                 <w:rPr>
                   <w:rStyle w:val="Hyperlink"/>
@@ -4531,7 +4564,7 @@
             <w:r>
               <w:t xml:space="preserve"> </w:t>
             </w:r>
-            <w:hyperlink r:id="rId69">
+            <w:hyperlink r:id="rId72">
               <w:r>
                 <w:rPr>
                   <w:rStyle w:val="Hyperlink"/>
@@ -4621,7 +4654,7 @@
             <w:r>
               <w:t xml:space="preserve"> </w:t>
             </w:r>
-            <w:hyperlink r:id="rId70">
+            <w:hyperlink r:id="rId73">
               <w:r>
                 <w:rPr>
                   <w:rStyle w:val="Hyperlink"/>
@@ -4639,7 +4672,7 @@
             <w:r>
               <w:t xml:space="preserve"> </w:t>
             </w:r>
-            <w:hyperlink r:id="rId71">
+            <w:hyperlink r:id="rId74">
               <w:r>
                 <w:rPr>
                   <w:rStyle w:val="Hyperlink"/>
@@ -4655,7 +4688,7 @@
             <w:r>
               <w:t xml:space="preserve"> </w:t>
             </w:r>
-            <w:hyperlink r:id="rId72">
+            <w:hyperlink r:id="rId75">
               <w:r>
                 <w:rPr>
                   <w:rStyle w:val="Hyperlink"/>
@@ -4704,7 +4737,18 @@
             </w:pPr>
             <w:r>
               <w:t xml:space="preserve">2/12 Thu</w:t>
-            </w:r>
+              <w:br/>
+            </w:r>
+            <w:hyperlink r:id="rId76">
+              <w:r>
+                <w:rPr>
+                  <w:rStyle w:val="Hyperlink"/>
+                  <w:color w:val="0066CC"/>
+                  <w:u w:val="single"/>
+                </w:rPr>
+                <w:t xml:space="preserve">Recording</w:t>
+              </w:r>
+            </w:hyperlink>
           </w:p>
         </w:tc>
         <w:tc>
@@ -4725,7 +4769,7 @@
             <w:r>
               <w:t xml:space="preserve"> </w:t>
             </w:r>
-            <w:hyperlink r:id="rId73">
+            <w:hyperlink r:id="rId77">
               <w:r>
                 <w:rPr>
                   <w:rStyle w:val="Hyperlink"/>
@@ -4797,7 +4841,18 @@
             </w:pPr>
             <w:r>
               <w:t xml:space="preserve">2/17 Tue</w:t>
-            </w:r>
+              <w:br/>
+            </w:r>
+            <w:hyperlink r:id="rId78">
+              <w:r>
+                <w:rPr>
+                  <w:rStyle w:val="Hyperlink"/>
+                  <w:color w:val="0066CC"/>
+                  <w:u w:val="single"/>
+                </w:rPr>
+                <w:t xml:space="preserve">Recording</w:t>
+              </w:r>
+            </w:hyperlink>
           </w:p>
         </w:tc>
         <w:tc>
@@ -4818,7 +4873,7 @@
             <w:r>
               <w:t xml:space="preserve"> </w:t>
             </w:r>
-            <w:hyperlink r:id="rId74">
+            <w:hyperlink r:id="rId79">
               <w:r>
                 <w:rPr>
                   <w:rStyle w:val="Hyperlink"/>
@@ -4838,7 +4893,7 @@
             <w:r>
               <w:t xml:space="preserve"> </w:t>
             </w:r>
-            <w:hyperlink r:id="rId75">
+            <w:hyperlink r:id="rId80">
               <w:r>
                 <w:rPr>
                   <w:rStyle w:val="Hyperlink"/>
@@ -4874,7 +4929,23 @@
               <w:t xml:space="preserve">- Continues on 2/19</w:t>
               <w:br/>
             </w:r>
-            <w:hyperlink r:id="rId76">
+            <w:hyperlink r:id="rId81">
+              <w:r>
+                <w:rPr>
+                  <w:rStyle w:val="Hyperlink"/>
+                  <w:color w:val="0066CC"/>
+                  <w:u w:val="single"/>
+                </w:rPr>
+                <w:t xml:space="preserve">Instructions</w:t>
+              </w:r>
+            </w:hyperlink>
+            <w:r>
+              <w:t xml:space="preserve">,</w:t>
+            </w:r>
+            <w:r>
+              <w:t xml:space="preserve"> </w:t>
+            </w:r>
+            <w:hyperlink r:id="rId82">
               <w:r>
                 <w:rPr>
                   <w:rStyle w:val="Hyperlink"/>
@@ -4926,7 +4997,18 @@
             </w:pPr>
             <w:r>
               <w:t xml:space="preserve">2/19 Thu</w:t>
-            </w:r>
+              <w:br/>
+            </w:r>
+            <w:hyperlink r:id="rId83">
+              <w:r>
+                <w:rPr>
+                  <w:rStyle w:val="Hyperlink"/>
+                  <w:color w:val="0066CC"/>
+                  <w:u w:val="single"/>
+                </w:rPr>
+                <w:t xml:space="preserve">Recording</w:t>
+              </w:r>
+            </w:hyperlink>
           </w:p>
         </w:tc>
         <w:tc>
@@ -4942,7 +5024,7 @@
                 <w:b/>
                 <w:bCs/>
               </w:rPr>
-              <w:t xml:space="preserve">Activity 3: Hiring with Numbers - A Regression Analysis Exercise, Part 1</w:t>
+              <w:t xml:space="preserve">Activity 3: Hiring with Numbers - A Regression Analysis Exercise, Part 2</w:t>
             </w:r>
             <w:r>
               <w:t xml:space="preserve"> </w:t>
@@ -4986,7 +5068,18 @@
             </w:pPr>
             <w:r>
               <w:t xml:space="preserve">2/24 Tue</w:t>
-            </w:r>
+              <w:br/>
+            </w:r>
+            <w:hyperlink r:id="rId84">
+              <w:r>
+                <w:rPr>
+                  <w:rStyle w:val="Hyperlink"/>
+                  <w:color w:val="0066CC"/>
+                  <w:u w:val="single"/>
+                </w:rPr>
+                <w:t xml:space="preserve">Recording</w:t>
+              </w:r>
+            </w:hyperlink>
           </w:p>
         </w:tc>
         <w:tc>
@@ -5007,7 +5100,7 @@
             <w:r>
               <w:t xml:space="preserve"> </w:t>
             </w:r>
-            <w:hyperlink r:id="rId77">
+            <w:hyperlink r:id="rId85">
               <w:r>
                 <w:rPr>
                   <w:rStyle w:val="Hyperlink"/>
@@ -5027,7 +5120,7 @@
             <w:r>
               <w:t xml:space="preserve"> </w:t>
             </w:r>
-            <w:hyperlink r:id="rId78">
+            <w:hyperlink r:id="rId86">
               <w:r>
                 <w:rPr>
                   <w:rStyle w:val="Hyperlink"/>
@@ -5064,7 +5157,7 @@
             <w:r>
               <w:t xml:space="preserve"> </w:t>
             </w:r>
-            <w:hyperlink r:id="rId79">
+            <w:hyperlink r:id="rId87">
               <w:r>
                 <w:rPr>
                   <w:rStyle w:val="Hyperlink"/>
@@ -5152,7 +5245,18 @@
             </w:pPr>
             <w:r>
               <w:t xml:space="preserve">2/26 Thu</w:t>
-            </w:r>
+              <w:br/>
+            </w:r>
+            <w:hyperlink r:id="rId88">
+              <w:r>
+                <w:rPr>
+                  <w:rStyle w:val="Hyperlink"/>
+                  <w:color w:val="0066CC"/>
+                  <w:u w:val="single"/>
+                </w:rPr>
+                <w:t xml:space="preserve">Recording</w:t>
+              </w:r>
+            </w:hyperlink>
           </w:p>
         </w:tc>
         <w:tc>
@@ -5173,7 +5277,7 @@
             <w:r>
               <w:t xml:space="preserve"> </w:t>
             </w:r>
-            <w:hyperlink r:id="rId80">
+            <w:hyperlink r:id="rId89">
               <w:r>
                 <w:rPr>
                   <w:rStyle w:val="Hyperlink"/>
@@ -5286,7 +5390,18 @@
             </w:pPr>
             <w:r>
               <w:t xml:space="preserve">3/05 Thu</w:t>
-            </w:r>
+              <w:br/>
+            </w:r>
+            <w:hyperlink r:id="rId90">
+              <w:r>
+                <w:rPr>
+                  <w:rStyle w:val="Hyperlink"/>
+                  <w:color w:val="0066CC"/>
+                  <w:u w:val="single"/>
+                </w:rPr>
+                <w:t xml:space="preserve">Recording</w:t>
+              </w:r>
+            </w:hyperlink>
           </w:p>
         </w:tc>
         <w:tc>
@@ -5308,7 +5423,7 @@
               <w:t xml:space="preserve"/>
               <w:br/>
             </w:r>
-            <w:hyperlink r:id="rId81">
+            <w:hyperlink r:id="rId91">
               <w:r>
                 <w:rPr>
                   <w:rStyle w:val="Hyperlink"/>
@@ -5377,7 +5492,7 @@
             <w:r>
               <w:t xml:space="preserve"> </w:t>
             </w:r>
-            <w:hyperlink r:id="rId82">
+            <w:hyperlink r:id="rId92">
               <w:r>
                 <w:rPr>
                   <w:rStyle w:val="Hyperlink"/>
@@ -5397,7 +5512,7 @@
             <w:r>
               <w:t xml:space="preserve"> </w:t>
             </w:r>
-            <w:hyperlink r:id="rId83">
+            <w:hyperlink r:id="rId93">
               <w:r>
                 <w:rPr>
                   <w:rStyle w:val="Hyperlink"/>
@@ -5434,7 +5549,7 @@
             <w:r>
               <w:t xml:space="preserve"> </w:t>
             </w:r>
-            <w:hyperlink r:id="rId84">
+            <w:hyperlink r:id="rId94">
               <w:r>
                 <w:rPr>
                   <w:rStyle w:val="Hyperlink"/>
@@ -5447,8 +5562,18 @@
             <w:r>
               <w:t xml:space="preserve"> </w:t>
             </w:r>
-            <w:r>
-              <w:t xml:space="preserve">[Slide]</w:t>
+            <w:hyperlink r:id="rId95">
+              <w:r>
+                <w:rPr>
+                  <w:rStyle w:val="Hyperlink"/>
+                  <w:color w:val="0066CC"/>
+                  <w:u w:val="single"/>
+                </w:rPr>
+                <w:t xml:space="preserve">Slide</w:t>
+              </w:r>
+            </w:hyperlink>
+            <w:r>
+              <w:t xml:space="preserve"/>
               <w:br/>
               <w:t xml:space="preserve">→ Presenters</w:t>
             </w:r>
@@ -5538,12 +5663,12 @@
                 <w:b/>
                 <w:bCs/>
               </w:rPr>
-              <w:t xml:space="preserve">🖥️ ONLINE CLASS (Zoom)</w:t>
-            </w:r>
-            <w:r>
-              <w:t xml:space="preserve"> </w:t>
-            </w:r>
-            <w:hyperlink r:id="rId85">
+              <w:t xml:space="preserve">Watch: Employment Law - Background Checks</w:t>
+            </w:r>
+            <w:r>
+              <w:t xml:space="preserve"> </w:t>
+            </w:r>
+            <w:hyperlink r:id="rId96">
               <w:r>
                 <w:rPr>
                   <w:rStyle w:val="Hyperlink"/>
@@ -5555,6 +5680,8 @@
             </w:hyperlink>
             <w:r>
               <w:t xml:space="preserve"/>
+              <w:br/>
+              <w:t xml:space="preserve">⚠️ This video will be included in the Final Exam I.</w:t>
               <w:br/>
               <w:br/>
             </w:r>
@@ -5568,7 +5695,7 @@
             <w:r>
               <w:t xml:space="preserve"> </w:t>
             </w:r>
-            <w:hyperlink r:id="rId86">
+            <w:hyperlink r:id="rId97">
               <w:r>
                 <w:rPr>
                   <w:rStyle w:val="Hyperlink"/>
@@ -5661,7 +5788,7 @@
             <w:r>
               <w:t xml:space="preserve"> </w:t>
             </w:r>
-            <w:hyperlink r:id="rId87">
+            <w:hyperlink r:id="rId98">
               <w:r>
                 <w:rPr>
                   <w:rStyle w:val="Hyperlink"/>
@@ -5681,7 +5808,7 @@
             <w:r>
               <w:t xml:space="preserve"> </w:t>
             </w:r>
-            <w:hyperlink r:id="rId88">
+            <w:hyperlink r:id="rId99">
               <w:r>
                 <w:rPr>
                   <w:rStyle w:val="Hyperlink"/>
@@ -5718,7 +5845,7 @@
             <w:r>
               <w:t xml:space="preserve"> </w:t>
             </w:r>
-            <w:hyperlink r:id="rId89">
+            <w:hyperlink r:id="rId100">
               <w:r>
                 <w:rPr>
                   <w:rStyle w:val="Hyperlink"/>
@@ -5731,8 +5858,18 @@
             <w:r>
               <w:t xml:space="preserve"> </w:t>
             </w:r>
-            <w:r>
-              <w:t xml:space="preserve">[Slide]</w:t>
+            <w:hyperlink r:id="rId101">
+              <w:r>
+                <w:rPr>
+                  <w:rStyle w:val="Hyperlink"/>
+                  <w:color w:val="0066CC"/>
+                  <w:u w:val="single"/>
+                </w:rPr>
+                <w:t xml:space="preserve">Slide</w:t>
+              </w:r>
+            </w:hyperlink>
+            <w:r>
+              <w:t xml:space="preserve"/>
               <w:br/>
               <w:t xml:space="preserve">→ Presenters</w:t>
             </w:r>
@@ -5827,7 +5964,7 @@
             <w:r>
               <w:t xml:space="preserve"> </w:t>
             </w:r>
-            <w:hyperlink r:id="rId90">
+            <w:hyperlink r:id="rId102">
               <w:r>
                 <w:rPr>
                   <w:rStyle w:val="Hyperlink"/>
@@ -5920,7 +6057,7 @@
             <w:r>
               <w:t xml:space="preserve"> </w:t>
             </w:r>
-            <w:hyperlink r:id="rId91">
+            <w:hyperlink r:id="rId103">
               <w:r>
                 <w:rPr>
                   <w:rStyle w:val="Hyperlink"/>
@@ -5940,7 +6077,7 @@
             <w:r>
               <w:t xml:space="preserve"> </w:t>
             </w:r>
-            <w:hyperlink r:id="rId92">
+            <w:hyperlink r:id="rId104">
               <w:r>
                 <w:rPr>
                   <w:rStyle w:val="Hyperlink"/>
@@ -5977,7 +6114,7 @@
             <w:r>
               <w:t xml:space="preserve"> </w:t>
             </w:r>
-            <w:hyperlink r:id="rId93">
+            <w:hyperlink r:id="rId105">
               <w:r>
                 <w:rPr>
                   <w:rStyle w:val="Hyperlink"/>
@@ -5990,8 +6127,18 @@
             <w:r>
               <w:t xml:space="preserve"> </w:t>
             </w:r>
-            <w:r>
-              <w:t xml:space="preserve">[Slide]</w:t>
+            <w:hyperlink r:id="rId106">
+              <w:r>
+                <w:rPr>
+                  <w:rStyle w:val="Hyperlink"/>
+                  <w:color w:val="0066CC"/>
+                  <w:u w:val="single"/>
+                </w:rPr>
+                <w:t xml:space="preserve">Slide</w:t>
+              </w:r>
+            </w:hyperlink>
+            <w:r>
+              <w:t xml:space="preserve"/>
               <w:br/>
               <w:t xml:space="preserve">→ Presenters</w:t>
             </w:r>
@@ -6086,7 +6233,7 @@
             <w:r>
               <w:t xml:space="preserve"> </w:t>
             </w:r>
-            <w:hyperlink r:id="rId94">
+            <w:hyperlink r:id="rId107">
               <w:r>
                 <w:rPr>
                   <w:rStyle w:val="Hyperlink"/>
@@ -6243,7 +6390,7 @@
             <w:r>
               <w:t xml:space="preserve"> </w:t>
             </w:r>
-            <w:hyperlink r:id="rId95">
+            <w:hyperlink r:id="rId108">
               <w:r>
                 <w:rPr>
                   <w:rStyle w:val="Hyperlink"/>
@@ -6263,7 +6410,7 @@
             <w:r>
               <w:t xml:space="preserve"> </w:t>
             </w:r>
-            <w:hyperlink r:id="rId96">
+            <w:hyperlink r:id="rId109">
               <w:r>
                 <w:rPr>
                   <w:rStyle w:val="Hyperlink"/>
@@ -6299,7 +6446,7 @@
               <w:t xml:space="preserve">- Continues on 4/9</w:t>
               <w:br/>
             </w:r>
-            <w:hyperlink r:id="rId97">
+            <w:hyperlink r:id="rId110">
               <w:r>
                 <w:rPr>
                   <w:rStyle w:val="Hyperlink"/>
@@ -6317,7 +6464,7 @@
             <w:r>
               <w:t xml:space="preserve"> </w:t>
             </w:r>
-            <w:hyperlink r:id="rId98">
+            <w:hyperlink r:id="rId111">
               <w:r>
                 <w:rPr>
                   <w:rStyle w:val="Hyperlink"/>
@@ -6422,7 +6569,7 @@
             <w:r>
               <w:t xml:space="preserve"> </w:t>
             </w:r>
-            <w:hyperlink r:id="rId99">
+            <w:hyperlink r:id="rId112">
               <w:r>
                 <w:rPr>
                   <w:rStyle w:val="Hyperlink"/>
@@ -6442,7 +6589,7 @@
             <w:r>
               <w:t xml:space="preserve"> </w:t>
             </w:r>
-            <w:hyperlink r:id="rId100">
+            <w:hyperlink r:id="rId113">
               <w:r>
                 <w:rPr>
                   <w:rStyle w:val="Hyperlink"/>
@@ -6474,7 +6621,7 @@
             <w:r>
               <w:t xml:space="preserve"> </w:t>
             </w:r>
-            <w:hyperlink r:id="rId101">
+            <w:hyperlink r:id="rId114">
               <w:r>
                 <w:rPr>
                   <w:rStyle w:val="Hyperlink"/>
@@ -6492,7 +6639,7 @@
             <w:r>
               <w:t xml:space="preserve"> </w:t>
             </w:r>
-            <w:hyperlink r:id="rId102">
+            <w:hyperlink r:id="rId115">
               <w:r>
                 <w:rPr>
                   <w:rStyle w:val="Hyperlink"/>
@@ -6510,7 +6657,7 @@
             <w:r>
               <w:t xml:space="preserve"> </w:t>
             </w:r>
-            <w:hyperlink r:id="rId103">
+            <w:hyperlink r:id="rId116">
               <w:r>
                 <w:rPr>
                   <w:rStyle w:val="Hyperlink"/>
@@ -6528,7 +6675,7 @@
             <w:r>
               <w:t xml:space="preserve"> </w:t>
             </w:r>
-            <w:hyperlink r:id="rId104">
+            <w:hyperlink r:id="rId117">
               <w:r>
                 <w:rPr>
                   <w:rStyle w:val="Hyperlink"/>
@@ -6546,7 +6693,7 @@
             <w:r>
               <w:t xml:space="preserve"> </w:t>
             </w:r>
-            <w:hyperlink r:id="rId105">
+            <w:hyperlink r:id="rId118">
               <w:r>
                 <w:rPr>
                   <w:rStyle w:val="Hyperlink"/>
@@ -6573,7 +6720,7 @@
             <w:r>
               <w:t xml:space="preserve"> </w:t>
             </w:r>
-            <w:hyperlink r:id="rId106">
+            <w:hyperlink r:id="rId119">
               <w:r>
                 <w:rPr>
                   <w:rStyle w:val="Hyperlink"/>
@@ -6666,7 +6813,7 @@
             <w:r>
               <w:t xml:space="preserve"> </w:t>
             </w:r>
-            <w:hyperlink r:id="rId101">
+            <w:hyperlink r:id="rId114">
               <w:r>
                 <w:rPr>
                   <w:rStyle w:val="Hyperlink"/>
@@ -6684,7 +6831,7 @@
             <w:r>
               <w:t xml:space="preserve"> </w:t>
             </w:r>
-            <w:hyperlink r:id="rId102">
+            <w:hyperlink r:id="rId115">
               <w:r>
                 <w:rPr>
                   <w:rStyle w:val="Hyperlink"/>
@@ -6702,7 +6849,7 @@
             <w:r>
               <w:t xml:space="preserve"> </w:t>
             </w:r>
-            <w:hyperlink r:id="rId103">
+            <w:hyperlink r:id="rId116">
               <w:r>
                 <w:rPr>
                   <w:rStyle w:val="Hyperlink"/>
@@ -6720,7 +6867,7 @@
             <w:r>
               <w:t xml:space="preserve"> </w:t>
             </w:r>
-            <w:hyperlink r:id="rId104">
+            <w:hyperlink r:id="rId117">
               <w:r>
                 <w:rPr>
                   <w:rStyle w:val="Hyperlink"/>
@@ -6738,7 +6885,7 @@
             <w:r>
               <w:t xml:space="preserve"> </w:t>
             </w:r>
-            <w:hyperlink r:id="rId105">
+            <w:hyperlink r:id="rId118">
               <w:r>
                 <w:rPr>
                   <w:rStyle w:val="Hyperlink"/>
@@ -6810,7 +6957,7 @@
             <w:r>
               <w:t xml:space="preserve"> </w:t>
             </w:r>
-            <w:hyperlink r:id="rId107">
+            <w:hyperlink r:id="rId120">
               <w:r>
                 <w:rPr>
                   <w:rStyle w:val="Hyperlink"/>
@@ -6828,7 +6975,7 @@
             <w:r>
               <w:t xml:space="preserve"> </w:t>
             </w:r>
-            <w:hyperlink r:id="rId108">
+            <w:hyperlink r:id="rId121">
               <w:r>
                 <w:rPr>
                   <w:rStyle w:val="Hyperlink"/>
@@ -7010,7 +7157,7 @@
             <w:r>
               <w:t xml:space="preserve"> </w:t>
             </w:r>
-            <w:hyperlink r:id="rId109">
+            <w:hyperlink r:id="rId122">
               <w:r>
                 <w:rPr>
                   <w:rStyle w:val="Hyperlink"/>
@@ -7030,7 +7177,7 @@
             <w:r>
               <w:t xml:space="preserve"> </w:t>
             </w:r>
-            <w:hyperlink r:id="rId110">
+            <w:hyperlink r:id="rId123">
               <w:r>
                 <w:rPr>
                   <w:rStyle w:val="Hyperlink"/>
@@ -7051,7 +7198,7 @@
             <w:r>
               <w:t xml:space="preserve"> </w:t>
             </w:r>
-            <w:hyperlink r:id="rId111">
+            <w:hyperlink r:id="rId124">
               <w:r>
                 <w:rPr>
                   <w:rStyle w:val="Hyperlink"/>
@@ -7088,7 +7235,7 @@
             <w:r>
               <w:t xml:space="preserve"> </w:t>
             </w:r>
-            <w:hyperlink r:id="rId112">
+            <w:hyperlink r:id="rId125">
               <w:r>
                 <w:rPr>
                   <w:rStyle w:val="Hyperlink"/>
@@ -7098,8 +7245,18 @@
                 <w:t xml:space="preserve">Link</w:t>
               </w:r>
             </w:hyperlink>
-            <w:r>
-              <w:t xml:space="preserve">[Slide]</w:t>
+            <w:hyperlink r:id="rId126">
+              <w:r>
+                <w:rPr>
+                  <w:rStyle w:val="Hyperlink"/>
+                  <w:color w:val="0066CC"/>
+                  <w:u w:val="single"/>
+                </w:rPr>
+                <w:t xml:space="preserve">Slide</w:t>
+              </w:r>
+            </w:hyperlink>
+            <w:r>
+              <w:t xml:space="preserve"/>
               <w:br/>
               <w:t xml:space="preserve">→ Presenters</w:t>
             </w:r>
@@ -7194,7 +7351,7 @@
             <w:r>
               <w:t xml:space="preserve"> </w:t>
             </w:r>
-            <w:hyperlink r:id="rId113">
+            <w:hyperlink r:id="rId127">
               <w:r>
                 <w:rPr>
                   <w:rStyle w:val="Hyperlink"/>
@@ -7214,7 +7371,7 @@
             <w:r>
               <w:t xml:space="preserve"> </w:t>
             </w:r>
-            <w:hyperlink r:id="rId114">
+            <w:hyperlink r:id="rId128">
               <w:r>
                 <w:rPr>
                   <w:rStyle w:val="Hyperlink"/>
@@ -7252,7 +7409,7 @@
             <w:r>
               <w:t xml:space="preserve"> </w:t>
             </w:r>
-            <w:hyperlink r:id="rId115">
+            <w:hyperlink r:id="rId129">
               <w:r>
                 <w:rPr>
                   <w:rStyle w:val="Hyperlink"/>
@@ -7345,7 +7502,7 @@
             <w:r>
               <w:t xml:space="preserve"> </w:t>
             </w:r>
-            <w:hyperlink r:id="rId116">
+            <w:hyperlink r:id="rId130">
               <w:r>
                 <w:rPr>
                   <w:rStyle w:val="Hyperlink"/>
@@ -7365,7 +7522,7 @@
             <w:r>
               <w:t xml:space="preserve"> </w:t>
             </w:r>
-            <w:hyperlink r:id="rId117">
+            <w:hyperlink r:id="rId131">
               <w:r>
                 <w:rPr>
                   <w:rStyle w:val="Hyperlink"/>
@@ -7497,8 +7654,8 @@
         </w:pict>
       </w:r>
     </w:p>
-    <w:bookmarkEnd w:id="118"/>
-    <w:bookmarkStart w:id="119" w:name="statute-of-limitations"/>
+    <w:bookmarkEnd w:id="132"/>
+    <w:bookmarkStart w:id="133" w:name="statute-of-limitations"/>
     <w:p>
       <w:pPr>
         <w:pStyle w:val="Heading2"/>
@@ -7522,8 +7679,8 @@
         </w:pict>
       </w:r>
     </w:p>
-    <w:bookmarkEnd w:id="119"/>
-    <w:bookmarkStart w:id="120" w:name="Xcdf663987d64b083671ee3932ebb0b331517c8d"/>
+    <w:bookmarkEnd w:id="133"/>
+    <w:bookmarkStart w:id="134" w:name="Xcdf663987d64b083671ee3932ebb0b331517c8d"/>
     <w:p>
       <w:pPr>
         <w:pStyle w:val="Heading2"/>
@@ -7636,8 +7793,8 @@
         <w:t xml:space="preserve">Please email at spak2@csub.edu if you are interested in knowing more about the student chapter.</w:t>
       </w:r>
     </w:p>
-    <w:bookmarkEnd w:id="120"/>
-    <w:bookmarkStart w:id="121" w:name="Xb583615bf7900c58ca4ec1c55b87d89181c5454"/>
+    <w:bookmarkEnd w:id="134"/>
+    <w:bookmarkStart w:id="135" w:name="Xb583615bf7900c58ca4ec1c55b87d89181c5454"/>
     <w:p>
       <w:pPr>
         <w:pStyle w:val="Heading2"/>
@@ -7681,8 +7838,8 @@
         </w:pict>
       </w:r>
     </w:p>
-    <w:bookmarkEnd w:id="121"/>
-    <w:bookmarkStart w:id="122" w:name="inclusiveness-and-safety-at-csub"/>
+    <w:bookmarkEnd w:id="135"/>
+    <w:bookmarkStart w:id="136" w:name="inclusiveness-and-safety-at-csub"/>
     <w:p>
       <w:pPr>
         <w:pStyle w:val="Heading2"/>
@@ -7734,8 +7891,8 @@
         </w:pict>
       </w:r>
     </w:p>
-    <w:bookmarkEnd w:id="122"/>
-    <w:bookmarkStart w:id="123" w:name="X3ca00938d41e62e7e6f8de7a6b6718fae956584"/>
+    <w:bookmarkEnd w:id="136"/>
+    <w:bookmarkStart w:id="137" w:name="X3ca00938d41e62e7e6f8de7a6b6718fae956584"/>
     <w:p>
       <w:pPr>
         <w:pStyle w:val="Heading2"/>
@@ -7895,8 +8052,8 @@
         </w:pict>
       </w:r>
     </w:p>
-    <w:bookmarkEnd w:id="123"/>
-    <w:bookmarkStart w:id="124" w:name="academic-integrity"/>
+    <w:bookmarkEnd w:id="137"/>
+    <w:bookmarkStart w:id="138" w:name="academic-integrity"/>
     <w:p>
       <w:pPr>
         <w:pStyle w:val="Heading2"/>
@@ -7936,8 +8093,8 @@
         </w:pict>
       </w:r>
     </w:p>
-    <w:bookmarkEnd w:id="124"/>
-    <w:bookmarkStart w:id="125" w:name="using-ai-tools-chatgpt"/>
+    <w:bookmarkEnd w:id="138"/>
+    <w:bookmarkStart w:id="139" w:name="using-ai-tools-chatgpt"/>
     <w:p>
       <w:pPr>
         <w:pStyle w:val="Heading2"/>
@@ -8046,8 +8203,8 @@
         </w:pict>
       </w:r>
     </w:p>
-    <w:bookmarkEnd w:id="125"/>
-    <w:bookmarkStart w:id="126" w:name="catalog-statement"/>
+    <w:bookmarkEnd w:id="139"/>
+    <w:bookmarkStart w:id="140" w:name="catalog-statement"/>
     <w:p>
       <w:pPr>
         <w:pStyle w:val="Heading2"/>
@@ -8071,8 +8228,8 @@
         </w:pict>
       </w:r>
     </w:p>
-    <w:bookmarkEnd w:id="126"/>
-    <w:bookmarkStart w:id="127" w:name="cece-workshops-events"/>
+    <w:bookmarkEnd w:id="140"/>
+    <w:bookmarkStart w:id="141" w:name="cece-workshops-events"/>
     <w:p>
       <w:pPr>
         <w:pStyle w:val="Heading2"/>
@@ -8104,8 +8261,8 @@
         </w:pict>
       </w:r>
     </w:p>
-    <w:bookmarkEnd w:id="127"/>
-    <w:bookmarkStart w:id="147" w:name="related-files"/>
+    <w:bookmarkEnd w:id="141"/>
+    <w:bookmarkStart w:id="161" w:name="related-files"/>
     <w:p>
       <w:pPr>
         <w:pStyle w:val="Heading2"/>
@@ -8114,7 +8271,7 @@
         <w:t xml:space="preserve">Related Files</w:t>
       </w:r>
     </w:p>
-    <w:bookmarkStart w:id="130" w:name="rubrics-guidelines"/>
+    <w:bookmarkStart w:id="144" w:name="rubrics-guidelines"/>
     <w:p>
       <w:pPr>
         <w:pStyle w:val="Heading3"/>
@@ -8130,7 +8287,7 @@
           <w:numId w:val="1010"/>
         </w:numPr>
       </w:pPr>
-      <w:hyperlink r:id="rId128">
+      <w:hyperlink r:id="rId142">
         <w:r>
           <w:rPr>
             <w:rStyle w:val="Hyperlink"/>
@@ -8154,7 +8311,7 @@
           <w:numId w:val="1010"/>
         </w:numPr>
       </w:pPr>
-      <w:hyperlink r:id="rId129">
+      <w:hyperlink r:id="rId143">
         <w:r>
           <w:rPr>
             <w:rStyle w:val="Hyperlink"/>
@@ -8171,8 +8328,8 @@
         <w:t xml:space="preserve">- Instructions and grading criteria for team meetings</w:t>
       </w:r>
     </w:p>
-    <w:bookmarkEnd w:id="130"/>
-    <w:bookmarkStart w:id="142" w:name="team-meeting-agendas"/>
+    <w:bookmarkEnd w:id="144"/>
+    <w:bookmarkStart w:id="156" w:name="team-meeting-agendas"/>
     <w:p>
       <w:pPr>
         <w:pStyle w:val="Heading3"/>
@@ -8188,7 +8345,7 @@
           <w:numId w:val="1011"/>
         </w:numPr>
       </w:pPr>
-      <w:hyperlink r:id="rId131">
+      <w:hyperlink r:id="rId145">
         <w:r>
           <w:rPr>
             <w:rStyle w:val="Hyperlink"/>
@@ -8212,7 +8369,7 @@
           <w:numId w:val="1011"/>
         </w:numPr>
       </w:pPr>
-      <w:hyperlink r:id="rId132">
+      <w:hyperlink r:id="rId146">
         <w:r>
           <w:rPr>
             <w:rStyle w:val="Hyperlink"/>
@@ -8236,7 +8393,7 @@
           <w:numId w:val="1011"/>
         </w:numPr>
       </w:pPr>
-      <w:hyperlink r:id="rId133">
+      <w:hyperlink r:id="rId147">
         <w:r>
           <w:rPr>
             <w:rStyle w:val="Hyperlink"/>
@@ -8260,7 +8417,7 @@
           <w:numId w:val="1011"/>
         </w:numPr>
       </w:pPr>
-      <w:hyperlink r:id="rId134">
+      <w:hyperlink r:id="rId148">
         <w:r>
           <w:rPr>
             <w:rStyle w:val="Hyperlink"/>
@@ -8284,7 +8441,7 @@
           <w:numId w:val="1011"/>
         </w:numPr>
       </w:pPr>
-      <w:hyperlink r:id="rId135">
+      <w:hyperlink r:id="rId149">
         <w:r>
           <w:rPr>
             <w:rStyle w:val="Hyperlink"/>
@@ -8308,7 +8465,7 @@
           <w:numId w:val="1011"/>
         </w:numPr>
       </w:pPr>
-      <w:hyperlink r:id="rId136">
+      <w:hyperlink r:id="rId150">
         <w:r>
           <w:rPr>
             <w:rStyle w:val="Hyperlink"/>
@@ -8332,7 +8489,7 @@
           <w:numId w:val="1011"/>
         </w:numPr>
       </w:pPr>
-      <w:hyperlink r:id="rId137">
+      <w:hyperlink r:id="rId151">
         <w:r>
           <w:rPr>
             <w:rStyle w:val="Hyperlink"/>
@@ -8356,7 +8513,7 @@
           <w:numId w:val="1011"/>
         </w:numPr>
       </w:pPr>
-      <w:hyperlink r:id="rId138">
+      <w:hyperlink r:id="rId152">
         <w:r>
           <w:rPr>
             <w:rStyle w:val="Hyperlink"/>
@@ -8380,7 +8537,7 @@
           <w:numId w:val="1011"/>
         </w:numPr>
       </w:pPr>
-      <w:hyperlink r:id="rId139">
+      <w:hyperlink r:id="rId153">
         <w:r>
           <w:rPr>
             <w:rStyle w:val="Hyperlink"/>
@@ -8404,7 +8561,7 @@
           <w:numId w:val="1011"/>
         </w:numPr>
       </w:pPr>
-      <w:hyperlink r:id="rId140">
+      <w:hyperlink r:id="rId154">
         <w:r>
           <w:rPr>
             <w:rStyle w:val="Hyperlink"/>
@@ -8428,7 +8585,7 @@
           <w:numId w:val="1011"/>
         </w:numPr>
       </w:pPr>
-      <w:hyperlink r:id="rId141">
+      <w:hyperlink r:id="rId155">
         <w:r>
           <w:rPr>
             <w:rStyle w:val="Hyperlink"/>
@@ -8445,8 +8602,8 @@
         <w:t xml:space="preserve">- Week 15 (Last)</w:t>
       </w:r>
     </w:p>
-    <w:bookmarkEnd w:id="142"/>
-    <w:bookmarkStart w:id="144" w:name="schedules-rosters"/>
+    <w:bookmarkEnd w:id="156"/>
+    <w:bookmarkStart w:id="158" w:name="schedules-rosters"/>
     <w:p>
       <w:pPr>
         <w:pStyle w:val="Heading3"/>
@@ -8463,7 +8620,7 @@
           <w:numId w:val="1012"/>
         </w:numPr>
       </w:pPr>
-      <w:hyperlink r:id="rId143">
+      <w:hyperlink r:id="rId157">
         <w:r>
           <w:rPr>
             <w:rStyle w:val="Hyperlink"/>
@@ -8480,8 +8637,8 @@
         <w:t xml:space="preserve">- Class roster and team assignments</w:t>
       </w:r>
     </w:p>
-    <w:bookmarkEnd w:id="144"/>
-    <w:bookmarkStart w:id="146" w:name="external-links"/>
+    <w:bookmarkEnd w:id="158"/>
+    <w:bookmarkStart w:id="160" w:name="external-links"/>
     <w:p>
       <w:pPr>
         <w:pStyle w:val="Heading3"/>
@@ -8569,7 +8726,7 @@
           <w:numId w:val="1013"/>
         </w:numPr>
       </w:pPr>
-      <w:hyperlink r:id="rId145">
+      <w:hyperlink r:id="rId159">
         <w:r>
           <w:rPr>
             <w:rStyle w:val="Hyperlink"/>
@@ -8586,8 +8743,8 @@
         <w:t xml:space="preserve">- Editable syllabus document</w:t>
       </w:r>
     </w:p>
-    <w:bookmarkEnd w:id="146"/>
-    <w:bookmarkEnd w:id="147"/>
+    <w:bookmarkEnd w:id="160"/>
+    <w:bookmarkEnd w:id="161"/>
     <w:sectPr>
       <w:footnotePr>
         <w:numRestart w:val="eachSect"/>

</xml_diff>

<commit_message>
Add 3/10 recording link and team presentation slide links
- Add Ch 7 lecture recording link (3/10)
- Add Team 6, 8, 3, 4 presentation slide links

Co-Authored-By: Claude Opus 4.6 <noreply@anthropic.com>
</commit_message>
<xml_diff>
--- a/Syllabus.docx
+++ b/Syllabus.docx
@@ -3439,7 +3439,7 @@
     </w:p>
     <w:bookmarkEnd w:id="48"/>
     <w:bookmarkEnd w:id="49"/>
-    <w:bookmarkStart w:id="132" w:name="course-agenda"/>
+    <w:bookmarkStart w:id="137" w:name="course-agenda"/>
     <w:p>
       <w:pPr>
         <w:pStyle w:val="Heading2"/>
@@ -3985,8 +3985,18 @@
             <w:r>
               <w:t xml:space="preserve"> </w:t>
             </w:r>
-            <w:r>
-              <w:t xml:space="preserve">[Slide]</w:t>
+            <w:hyperlink r:id="rId62">
+              <w:r>
+                <w:rPr>
+                  <w:rStyle w:val="Hyperlink"/>
+                  <w:color w:val="0066CC"/>
+                  <w:u w:val="single"/>
+                </w:rPr>
+                <w:t xml:space="preserve">Slide</w:t>
+              </w:r>
+            </w:hyperlink>
+            <w:r>
+              <w:t xml:space="preserve"/>
               <w:br/>
               <w:t xml:space="preserve">→ Presenters</w:t>
             </w:r>
@@ -4062,7 +4072,7 @@
               <w:t xml:space="preserve">1/29 Thu</w:t>
               <w:br/>
             </w:r>
-            <w:hyperlink r:id="rId62">
+            <w:hyperlink r:id="rId63">
               <w:r>
                 <w:rPr>
                   <w:rStyle w:val="Hyperlink"/>
@@ -4092,7 +4102,7 @@
             <w:r>
               <w:t xml:space="preserve"> </w:t>
             </w:r>
-            <w:hyperlink r:id="rId63">
+            <w:hyperlink r:id="rId64">
               <w:r>
                 <w:rPr>
                   <w:rStyle w:val="Hyperlink"/>
@@ -4207,7 +4217,7 @@
               <w:t xml:space="preserve">2/03 Tue</w:t>
               <w:br/>
             </w:r>
-            <w:hyperlink r:id="rId64">
+            <w:hyperlink r:id="rId65">
               <w:r>
                 <w:rPr>
                   <w:rStyle w:val="Hyperlink"/>
@@ -4237,7 +4247,7 @@
             <w:r>
               <w:t xml:space="preserve"> </w:t>
             </w:r>
-            <w:hyperlink r:id="rId65">
+            <w:hyperlink r:id="rId66">
               <w:r>
                 <w:rPr>
                   <w:rStyle w:val="Hyperlink"/>
@@ -4257,7 +4267,7 @@
             <w:r>
               <w:t xml:space="preserve"> </w:t>
             </w:r>
-            <w:hyperlink r:id="rId66">
+            <w:hyperlink r:id="rId67">
               <w:r>
                 <w:rPr>
                   <w:rStyle w:val="Hyperlink"/>
@@ -4294,7 +4304,7 @@
             <w:r>
               <w:t xml:space="preserve"> </w:t>
             </w:r>
-            <w:hyperlink r:id="rId67">
+            <w:hyperlink r:id="rId68">
               <w:r>
                 <w:rPr>
                   <w:rStyle w:val="Hyperlink"/>
@@ -4307,8 +4317,18 @@
             <w:r>
               <w:t xml:space="preserve"> </w:t>
             </w:r>
-            <w:r>
-              <w:t xml:space="preserve">[Slide]</w:t>
+            <w:hyperlink r:id="rId69">
+              <w:r>
+                <w:rPr>
+                  <w:rStyle w:val="Hyperlink"/>
+                  <w:color w:val="0066CC"/>
+                  <w:u w:val="single"/>
+                </w:rPr>
+                <w:t xml:space="preserve">Slide</w:t>
+              </w:r>
+            </w:hyperlink>
+            <w:r>
+              <w:t xml:space="preserve"/>
               <w:br/>
               <w:t xml:space="preserve">→ Presenters</w:t>
             </w:r>
@@ -4384,7 +4404,7 @@
               <w:t xml:space="preserve">2/05 Thu</w:t>
               <w:br/>
             </w:r>
-            <w:hyperlink r:id="rId68">
+            <w:hyperlink r:id="rId70">
               <w:r>
                 <w:rPr>
                   <w:rStyle w:val="Hyperlink"/>
@@ -4414,7 +4434,7 @@
             <w:r>
               <w:t xml:space="preserve"> </w:t>
             </w:r>
-            <w:hyperlink r:id="rId69">
+            <w:hyperlink r:id="rId71">
               <w:r>
                 <w:rPr>
                   <w:rStyle w:val="Hyperlink"/>
@@ -4507,7 +4527,7 @@
             <w:r>
               <w:t xml:space="preserve"> </w:t>
             </w:r>
-            <w:hyperlink r:id="rId70">
+            <w:hyperlink r:id="rId72">
               <w:r>
                 <w:rPr>
                   <w:rStyle w:val="Hyperlink"/>
@@ -4527,7 +4547,7 @@
             <w:r>
               <w:t xml:space="preserve"> </w:t>
             </w:r>
-            <w:hyperlink r:id="rId71">
+            <w:hyperlink r:id="rId73">
               <w:r>
                 <w:rPr>
                   <w:rStyle w:val="Hyperlink"/>
@@ -4564,7 +4584,7 @@
             <w:r>
               <w:t xml:space="preserve"> </w:t>
             </w:r>
-            <w:hyperlink r:id="rId72">
+            <w:hyperlink r:id="rId74">
               <w:r>
                 <w:rPr>
                   <w:rStyle w:val="Hyperlink"/>
@@ -4577,8 +4597,18 @@
             <w:r>
               <w:t xml:space="preserve"> </w:t>
             </w:r>
-            <w:r>
-              <w:t xml:space="preserve">[Slide]</w:t>
+            <w:hyperlink r:id="rId75">
+              <w:r>
+                <w:rPr>
+                  <w:rStyle w:val="Hyperlink"/>
+                  <w:color w:val="0066CC"/>
+                  <w:u w:val="single"/>
+                </w:rPr>
+                <w:t xml:space="preserve">Slide</w:t>
+              </w:r>
+            </w:hyperlink>
+            <w:r>
+              <w:t xml:space="preserve"/>
               <w:br/>
               <w:t xml:space="preserve">→ Presenters</w:t>
             </w:r>
@@ -4654,7 +4684,7 @@
             <w:r>
               <w:t xml:space="preserve"> </w:t>
             </w:r>
-            <w:hyperlink r:id="rId73">
+            <w:hyperlink r:id="rId76">
               <w:r>
                 <w:rPr>
                   <w:rStyle w:val="Hyperlink"/>
@@ -4672,7 +4702,7 @@
             <w:r>
               <w:t xml:space="preserve"> </w:t>
             </w:r>
-            <w:hyperlink r:id="rId74">
+            <w:hyperlink r:id="rId77">
               <w:r>
                 <w:rPr>
                   <w:rStyle w:val="Hyperlink"/>
@@ -4688,7 +4718,7 @@
             <w:r>
               <w:t xml:space="preserve"> </w:t>
             </w:r>
-            <w:hyperlink r:id="rId75">
+            <w:hyperlink r:id="rId78">
               <w:r>
                 <w:rPr>
                   <w:rStyle w:val="Hyperlink"/>
@@ -4739,7 +4769,7 @@
               <w:t xml:space="preserve">2/12 Thu</w:t>
               <w:br/>
             </w:r>
-            <w:hyperlink r:id="rId76">
+            <w:hyperlink r:id="rId79">
               <w:r>
                 <w:rPr>
                   <w:rStyle w:val="Hyperlink"/>
@@ -4769,7 +4799,7 @@
             <w:r>
               <w:t xml:space="preserve"> </w:t>
             </w:r>
-            <w:hyperlink r:id="rId77">
+            <w:hyperlink r:id="rId80">
               <w:r>
                 <w:rPr>
                   <w:rStyle w:val="Hyperlink"/>
@@ -4843,7 +4873,7 @@
               <w:t xml:space="preserve">2/17 Tue</w:t>
               <w:br/>
             </w:r>
-            <w:hyperlink r:id="rId78">
+            <w:hyperlink r:id="rId81">
               <w:r>
                 <w:rPr>
                   <w:rStyle w:val="Hyperlink"/>
@@ -4873,7 +4903,7 @@
             <w:r>
               <w:t xml:space="preserve"> </w:t>
             </w:r>
-            <w:hyperlink r:id="rId79">
+            <w:hyperlink r:id="rId82">
               <w:r>
                 <w:rPr>
                   <w:rStyle w:val="Hyperlink"/>
@@ -4893,7 +4923,7 @@
             <w:r>
               <w:t xml:space="preserve"> </w:t>
             </w:r>
-            <w:hyperlink r:id="rId80">
+            <w:hyperlink r:id="rId83">
               <w:r>
                 <w:rPr>
                   <w:rStyle w:val="Hyperlink"/>
@@ -4929,7 +4959,7 @@
               <w:t xml:space="preserve">- Continues on 2/19</w:t>
               <w:br/>
             </w:r>
-            <w:hyperlink r:id="rId81">
+            <w:hyperlink r:id="rId84">
               <w:r>
                 <w:rPr>
                   <w:rStyle w:val="Hyperlink"/>
@@ -4945,7 +4975,7 @@
             <w:r>
               <w:t xml:space="preserve"> </w:t>
             </w:r>
-            <w:hyperlink r:id="rId82">
+            <w:hyperlink r:id="rId85">
               <w:r>
                 <w:rPr>
                   <w:rStyle w:val="Hyperlink"/>
@@ -4999,7 +5029,7 @@
               <w:t xml:space="preserve">2/19 Thu</w:t>
               <w:br/>
             </w:r>
-            <w:hyperlink r:id="rId83">
+            <w:hyperlink r:id="rId86">
               <w:r>
                 <w:rPr>
                   <w:rStyle w:val="Hyperlink"/>
@@ -5070,7 +5100,7 @@
               <w:t xml:space="preserve">2/24 Tue</w:t>
               <w:br/>
             </w:r>
-            <w:hyperlink r:id="rId84">
+            <w:hyperlink r:id="rId87">
               <w:r>
                 <w:rPr>
                   <w:rStyle w:val="Hyperlink"/>
@@ -5100,7 +5130,7 @@
             <w:r>
               <w:t xml:space="preserve"> </w:t>
             </w:r>
-            <w:hyperlink r:id="rId85">
+            <w:hyperlink r:id="rId88">
               <w:r>
                 <w:rPr>
                   <w:rStyle w:val="Hyperlink"/>
@@ -5120,7 +5150,7 @@
             <w:r>
               <w:t xml:space="preserve"> </w:t>
             </w:r>
-            <w:hyperlink r:id="rId86">
+            <w:hyperlink r:id="rId89">
               <w:r>
                 <w:rPr>
                   <w:rStyle w:val="Hyperlink"/>
@@ -5157,7 +5187,7 @@
             <w:r>
               <w:t xml:space="preserve"> </w:t>
             </w:r>
-            <w:hyperlink r:id="rId87">
+            <w:hyperlink r:id="rId90">
               <w:r>
                 <w:rPr>
                   <w:rStyle w:val="Hyperlink"/>
@@ -5170,8 +5200,18 @@
             <w:r>
               <w:t xml:space="preserve"> </w:t>
             </w:r>
-            <w:r>
-              <w:t xml:space="preserve">[Slide]</w:t>
+            <w:hyperlink r:id="rId91">
+              <w:r>
+                <w:rPr>
+                  <w:rStyle w:val="Hyperlink"/>
+                  <w:color w:val="0066CC"/>
+                  <w:u w:val="single"/>
+                </w:rPr>
+                <w:t xml:space="preserve">Slide</w:t>
+              </w:r>
+            </w:hyperlink>
+            <w:r>
+              <w:t xml:space="preserve"/>
               <w:br/>
               <w:t xml:space="preserve">→ Presenters</w:t>
             </w:r>
@@ -5247,7 +5287,7 @@
               <w:t xml:space="preserve">2/26 Thu</w:t>
               <w:br/>
             </w:r>
-            <w:hyperlink r:id="rId88">
+            <w:hyperlink r:id="rId92">
               <w:r>
                 <w:rPr>
                   <w:rStyle w:val="Hyperlink"/>
@@ -5277,7 +5317,7 @@
             <w:r>
               <w:t xml:space="preserve"> </w:t>
             </w:r>
-            <w:hyperlink r:id="rId89">
+            <w:hyperlink r:id="rId93">
               <w:r>
                 <w:rPr>
                   <w:rStyle w:val="Hyperlink"/>
@@ -5392,7 +5432,7 @@
               <w:t xml:space="preserve">3/05 Thu</w:t>
               <w:br/>
             </w:r>
-            <w:hyperlink r:id="rId90">
+            <w:hyperlink r:id="rId94">
               <w:r>
                 <w:rPr>
                   <w:rStyle w:val="Hyperlink"/>
@@ -5423,7 +5463,7 @@
               <w:t xml:space="preserve"/>
               <w:br/>
             </w:r>
-            <w:hyperlink r:id="rId91">
+            <w:hyperlink r:id="rId95">
               <w:r>
                 <w:rPr>
                   <w:rStyle w:val="Hyperlink"/>
@@ -5471,7 +5511,18 @@
             </w:pPr>
             <w:r>
               <w:t xml:space="preserve">3/10 Tue</w:t>
-            </w:r>
+              <w:br/>
+            </w:r>
+            <w:hyperlink r:id="rId96">
+              <w:r>
+                <w:rPr>
+                  <w:rStyle w:val="Hyperlink"/>
+                  <w:color w:val="0066CC"/>
+                  <w:u w:val="single"/>
+                </w:rPr>
+                <w:t xml:space="preserve">Recording</w:t>
+              </w:r>
+            </w:hyperlink>
           </w:p>
         </w:tc>
         <w:tc>
@@ -5492,7 +5543,7 @@
             <w:r>
               <w:t xml:space="preserve"> </w:t>
             </w:r>
-            <w:hyperlink r:id="rId92">
+            <w:hyperlink r:id="rId97">
               <w:r>
                 <w:rPr>
                   <w:rStyle w:val="Hyperlink"/>
@@ -5512,7 +5563,7 @@
             <w:r>
               <w:t xml:space="preserve"> </w:t>
             </w:r>
-            <w:hyperlink r:id="rId93">
+            <w:hyperlink r:id="rId98">
               <w:r>
                 <w:rPr>
                   <w:rStyle w:val="Hyperlink"/>
@@ -5549,7 +5600,7 @@
             <w:r>
               <w:t xml:space="preserve"> </w:t>
             </w:r>
-            <w:hyperlink r:id="rId94">
+            <w:hyperlink r:id="rId99">
               <w:r>
                 <w:rPr>
                   <w:rStyle w:val="Hyperlink"/>
@@ -5562,7 +5613,7 @@
             <w:r>
               <w:t xml:space="preserve"> </w:t>
             </w:r>
-            <w:hyperlink r:id="rId95">
+            <w:hyperlink r:id="rId100">
               <w:r>
                 <w:rPr>
                   <w:rStyle w:val="Hyperlink"/>
@@ -5668,7 +5719,7 @@
             <w:r>
               <w:t xml:space="preserve"> </w:t>
             </w:r>
-            <w:hyperlink r:id="rId96">
+            <w:hyperlink r:id="rId101">
               <w:r>
                 <w:rPr>
                   <w:rStyle w:val="Hyperlink"/>
@@ -5695,7 +5746,7 @@
             <w:r>
               <w:t xml:space="preserve"> </w:t>
             </w:r>
-            <w:hyperlink r:id="rId97">
+            <w:hyperlink r:id="rId102">
               <w:r>
                 <w:rPr>
                   <w:rStyle w:val="Hyperlink"/>
@@ -5788,7 +5839,7 @@
             <w:r>
               <w:t xml:space="preserve"> </w:t>
             </w:r>
-            <w:hyperlink r:id="rId98">
+            <w:hyperlink r:id="rId103">
               <w:r>
                 <w:rPr>
                   <w:rStyle w:val="Hyperlink"/>
@@ -5808,7 +5859,7 @@
             <w:r>
               <w:t xml:space="preserve"> </w:t>
             </w:r>
-            <w:hyperlink r:id="rId99">
+            <w:hyperlink r:id="rId104">
               <w:r>
                 <w:rPr>
                   <w:rStyle w:val="Hyperlink"/>
@@ -5845,7 +5896,7 @@
             <w:r>
               <w:t xml:space="preserve"> </w:t>
             </w:r>
-            <w:hyperlink r:id="rId100">
+            <w:hyperlink r:id="rId105">
               <w:r>
                 <w:rPr>
                   <w:rStyle w:val="Hyperlink"/>
@@ -5858,7 +5909,7 @@
             <w:r>
               <w:t xml:space="preserve"> </w:t>
             </w:r>
-            <w:hyperlink r:id="rId101">
+            <w:hyperlink r:id="rId106">
               <w:r>
                 <w:rPr>
                   <w:rStyle w:val="Hyperlink"/>
@@ -5964,7 +6015,7 @@
             <w:r>
               <w:t xml:space="preserve"> </w:t>
             </w:r>
-            <w:hyperlink r:id="rId102">
+            <w:hyperlink r:id="rId107">
               <w:r>
                 <w:rPr>
                   <w:rStyle w:val="Hyperlink"/>
@@ -6057,7 +6108,7 @@
             <w:r>
               <w:t xml:space="preserve"> </w:t>
             </w:r>
-            <w:hyperlink r:id="rId103">
+            <w:hyperlink r:id="rId108">
               <w:r>
                 <w:rPr>
                   <w:rStyle w:val="Hyperlink"/>
@@ -6077,7 +6128,7 @@
             <w:r>
               <w:t xml:space="preserve"> </w:t>
             </w:r>
-            <w:hyperlink r:id="rId104">
+            <w:hyperlink r:id="rId109">
               <w:r>
                 <w:rPr>
                   <w:rStyle w:val="Hyperlink"/>
@@ -6114,7 +6165,7 @@
             <w:r>
               <w:t xml:space="preserve"> </w:t>
             </w:r>
-            <w:hyperlink r:id="rId105">
+            <w:hyperlink r:id="rId110">
               <w:r>
                 <w:rPr>
                   <w:rStyle w:val="Hyperlink"/>
@@ -6127,7 +6178,7 @@
             <w:r>
               <w:t xml:space="preserve"> </w:t>
             </w:r>
-            <w:hyperlink r:id="rId106">
+            <w:hyperlink r:id="rId111">
               <w:r>
                 <w:rPr>
                   <w:rStyle w:val="Hyperlink"/>
@@ -6233,7 +6284,7 @@
             <w:r>
               <w:t xml:space="preserve"> </w:t>
             </w:r>
-            <w:hyperlink r:id="rId107">
+            <w:hyperlink r:id="rId112">
               <w:r>
                 <w:rPr>
                   <w:rStyle w:val="Hyperlink"/>
@@ -6390,7 +6441,7 @@
             <w:r>
               <w:t xml:space="preserve"> </w:t>
             </w:r>
-            <w:hyperlink r:id="rId108">
+            <w:hyperlink r:id="rId113">
               <w:r>
                 <w:rPr>
                   <w:rStyle w:val="Hyperlink"/>
@@ -6410,7 +6461,7 @@
             <w:r>
               <w:t xml:space="preserve"> </w:t>
             </w:r>
-            <w:hyperlink r:id="rId109">
+            <w:hyperlink r:id="rId114">
               <w:r>
                 <w:rPr>
                   <w:rStyle w:val="Hyperlink"/>
@@ -6446,7 +6497,7 @@
               <w:t xml:space="preserve">- Continues on 4/9</w:t>
               <w:br/>
             </w:r>
-            <w:hyperlink r:id="rId110">
+            <w:hyperlink r:id="rId115">
               <w:r>
                 <w:rPr>
                   <w:rStyle w:val="Hyperlink"/>
@@ -6464,7 +6515,7 @@
             <w:r>
               <w:t xml:space="preserve"> </w:t>
             </w:r>
-            <w:hyperlink r:id="rId111">
+            <w:hyperlink r:id="rId116">
               <w:r>
                 <w:rPr>
                   <w:rStyle w:val="Hyperlink"/>
@@ -6569,7 +6620,7 @@
             <w:r>
               <w:t xml:space="preserve"> </w:t>
             </w:r>
-            <w:hyperlink r:id="rId112">
+            <w:hyperlink r:id="rId117">
               <w:r>
                 <w:rPr>
                   <w:rStyle w:val="Hyperlink"/>
@@ -6589,7 +6640,7 @@
             <w:r>
               <w:t xml:space="preserve"> </w:t>
             </w:r>
-            <w:hyperlink r:id="rId113">
+            <w:hyperlink r:id="rId118">
               <w:r>
                 <w:rPr>
                   <w:rStyle w:val="Hyperlink"/>
@@ -6621,7 +6672,7 @@
             <w:r>
               <w:t xml:space="preserve"> </w:t>
             </w:r>
-            <w:hyperlink r:id="rId114">
+            <w:hyperlink r:id="rId119">
               <w:r>
                 <w:rPr>
                   <w:rStyle w:val="Hyperlink"/>
@@ -6639,7 +6690,7 @@
             <w:r>
               <w:t xml:space="preserve"> </w:t>
             </w:r>
-            <w:hyperlink r:id="rId115">
+            <w:hyperlink r:id="rId120">
               <w:r>
                 <w:rPr>
                   <w:rStyle w:val="Hyperlink"/>
@@ -6657,7 +6708,7 @@
             <w:r>
               <w:t xml:space="preserve"> </w:t>
             </w:r>
-            <w:hyperlink r:id="rId116">
+            <w:hyperlink r:id="rId121">
               <w:r>
                 <w:rPr>
                   <w:rStyle w:val="Hyperlink"/>
@@ -6675,7 +6726,7 @@
             <w:r>
               <w:t xml:space="preserve"> </w:t>
             </w:r>
-            <w:hyperlink r:id="rId117">
+            <w:hyperlink r:id="rId122">
               <w:r>
                 <w:rPr>
                   <w:rStyle w:val="Hyperlink"/>
@@ -6693,7 +6744,7 @@
             <w:r>
               <w:t xml:space="preserve"> </w:t>
             </w:r>
-            <w:hyperlink r:id="rId118">
+            <w:hyperlink r:id="rId123">
               <w:r>
                 <w:rPr>
                   <w:rStyle w:val="Hyperlink"/>
@@ -6720,7 +6771,7 @@
             <w:r>
               <w:t xml:space="preserve"> </w:t>
             </w:r>
-            <w:hyperlink r:id="rId119">
+            <w:hyperlink r:id="rId124">
               <w:r>
                 <w:rPr>
                   <w:rStyle w:val="Hyperlink"/>
@@ -6813,7 +6864,7 @@
             <w:r>
               <w:t xml:space="preserve"> </w:t>
             </w:r>
-            <w:hyperlink r:id="rId114">
+            <w:hyperlink r:id="rId119">
               <w:r>
                 <w:rPr>
                   <w:rStyle w:val="Hyperlink"/>
@@ -6831,7 +6882,7 @@
             <w:r>
               <w:t xml:space="preserve"> </w:t>
             </w:r>
-            <w:hyperlink r:id="rId115">
+            <w:hyperlink r:id="rId120">
               <w:r>
                 <w:rPr>
                   <w:rStyle w:val="Hyperlink"/>
@@ -6849,7 +6900,7 @@
             <w:r>
               <w:t xml:space="preserve"> </w:t>
             </w:r>
-            <w:hyperlink r:id="rId116">
+            <w:hyperlink r:id="rId121">
               <w:r>
                 <w:rPr>
                   <w:rStyle w:val="Hyperlink"/>
@@ -6867,7 +6918,7 @@
             <w:r>
               <w:t xml:space="preserve"> </w:t>
             </w:r>
-            <w:hyperlink r:id="rId117">
+            <w:hyperlink r:id="rId122">
               <w:r>
                 <w:rPr>
                   <w:rStyle w:val="Hyperlink"/>
@@ -6885,7 +6936,7 @@
             <w:r>
               <w:t xml:space="preserve"> </w:t>
             </w:r>
-            <w:hyperlink r:id="rId118">
+            <w:hyperlink r:id="rId123">
               <w:r>
                 <w:rPr>
                   <w:rStyle w:val="Hyperlink"/>
@@ -6957,7 +7008,7 @@
             <w:r>
               <w:t xml:space="preserve"> </w:t>
             </w:r>
-            <w:hyperlink r:id="rId120">
+            <w:hyperlink r:id="rId125">
               <w:r>
                 <w:rPr>
                   <w:rStyle w:val="Hyperlink"/>
@@ -6975,7 +7026,7 @@
             <w:r>
               <w:t xml:space="preserve"> </w:t>
             </w:r>
-            <w:hyperlink r:id="rId121">
+            <w:hyperlink r:id="rId126">
               <w:r>
                 <w:rPr>
                   <w:rStyle w:val="Hyperlink"/>
@@ -7157,7 +7208,7 @@
             <w:r>
               <w:t xml:space="preserve"> </w:t>
             </w:r>
-            <w:hyperlink r:id="rId122">
+            <w:hyperlink r:id="rId127">
               <w:r>
                 <w:rPr>
                   <w:rStyle w:val="Hyperlink"/>
@@ -7177,7 +7228,7 @@
             <w:r>
               <w:t xml:space="preserve"> </w:t>
             </w:r>
-            <w:hyperlink r:id="rId123">
+            <w:hyperlink r:id="rId128">
               <w:r>
                 <w:rPr>
                   <w:rStyle w:val="Hyperlink"/>
@@ -7198,7 +7249,7 @@
             <w:r>
               <w:t xml:space="preserve"> </w:t>
             </w:r>
-            <w:hyperlink r:id="rId124">
+            <w:hyperlink r:id="rId129">
               <w:r>
                 <w:rPr>
                   <w:rStyle w:val="Hyperlink"/>
@@ -7235,7 +7286,7 @@
             <w:r>
               <w:t xml:space="preserve"> </w:t>
             </w:r>
-            <w:hyperlink r:id="rId125">
+            <w:hyperlink r:id="rId130">
               <w:r>
                 <w:rPr>
                   <w:rStyle w:val="Hyperlink"/>
@@ -7245,7 +7296,7 @@
                 <w:t xml:space="preserve">Link</w:t>
               </w:r>
             </w:hyperlink>
-            <w:hyperlink r:id="rId126">
+            <w:hyperlink r:id="rId131">
               <w:r>
                 <w:rPr>
                   <w:rStyle w:val="Hyperlink"/>
@@ -7351,7 +7402,7 @@
             <w:r>
               <w:t xml:space="preserve"> </w:t>
             </w:r>
-            <w:hyperlink r:id="rId127">
+            <w:hyperlink r:id="rId132">
               <w:r>
                 <w:rPr>
                   <w:rStyle w:val="Hyperlink"/>
@@ -7371,7 +7422,7 @@
             <w:r>
               <w:t xml:space="preserve"> </w:t>
             </w:r>
-            <w:hyperlink r:id="rId128">
+            <w:hyperlink r:id="rId133">
               <w:r>
                 <w:rPr>
                   <w:rStyle w:val="Hyperlink"/>
@@ -7409,7 +7460,7 @@
             <w:r>
               <w:t xml:space="preserve"> </w:t>
             </w:r>
-            <w:hyperlink r:id="rId129">
+            <w:hyperlink r:id="rId134">
               <w:r>
                 <w:rPr>
                   <w:rStyle w:val="Hyperlink"/>
@@ -7502,7 +7553,7 @@
             <w:r>
               <w:t xml:space="preserve"> </w:t>
             </w:r>
-            <w:hyperlink r:id="rId130">
+            <w:hyperlink r:id="rId135">
               <w:r>
                 <w:rPr>
                   <w:rStyle w:val="Hyperlink"/>
@@ -7522,7 +7573,7 @@
             <w:r>
               <w:t xml:space="preserve"> </w:t>
             </w:r>
-            <w:hyperlink r:id="rId131">
+            <w:hyperlink r:id="rId136">
               <w:r>
                 <w:rPr>
                   <w:rStyle w:val="Hyperlink"/>
@@ -7654,8 +7705,8 @@
         </w:pict>
       </w:r>
     </w:p>
-    <w:bookmarkEnd w:id="132"/>
-    <w:bookmarkStart w:id="133" w:name="statute-of-limitations"/>
+    <w:bookmarkEnd w:id="137"/>
+    <w:bookmarkStart w:id="138" w:name="statute-of-limitations"/>
     <w:p>
       <w:pPr>
         <w:pStyle w:val="Heading2"/>
@@ -7679,8 +7730,8 @@
         </w:pict>
       </w:r>
     </w:p>
-    <w:bookmarkEnd w:id="133"/>
-    <w:bookmarkStart w:id="134" w:name="Xcdf663987d64b083671ee3932ebb0b331517c8d"/>
+    <w:bookmarkEnd w:id="138"/>
+    <w:bookmarkStart w:id="139" w:name="Xcdf663987d64b083671ee3932ebb0b331517c8d"/>
     <w:p>
       <w:pPr>
         <w:pStyle w:val="Heading2"/>
@@ -7793,8 +7844,8 @@
         <w:t xml:space="preserve">Please email at spak2@csub.edu if you are interested in knowing more about the student chapter.</w:t>
       </w:r>
     </w:p>
-    <w:bookmarkEnd w:id="134"/>
-    <w:bookmarkStart w:id="135" w:name="Xb583615bf7900c58ca4ec1c55b87d89181c5454"/>
+    <w:bookmarkEnd w:id="139"/>
+    <w:bookmarkStart w:id="140" w:name="Xb583615bf7900c58ca4ec1c55b87d89181c5454"/>
     <w:p>
       <w:pPr>
         <w:pStyle w:val="Heading2"/>
@@ -7838,8 +7889,8 @@
         </w:pict>
       </w:r>
     </w:p>
-    <w:bookmarkEnd w:id="135"/>
-    <w:bookmarkStart w:id="136" w:name="inclusiveness-and-safety-at-csub"/>
+    <w:bookmarkEnd w:id="140"/>
+    <w:bookmarkStart w:id="141" w:name="inclusiveness-and-safety-at-csub"/>
     <w:p>
       <w:pPr>
         <w:pStyle w:val="Heading2"/>
@@ -7891,8 +7942,8 @@
         </w:pict>
       </w:r>
     </w:p>
-    <w:bookmarkEnd w:id="136"/>
-    <w:bookmarkStart w:id="137" w:name="X3ca00938d41e62e7e6f8de7a6b6718fae956584"/>
+    <w:bookmarkEnd w:id="141"/>
+    <w:bookmarkStart w:id="142" w:name="X3ca00938d41e62e7e6f8de7a6b6718fae956584"/>
     <w:p>
       <w:pPr>
         <w:pStyle w:val="Heading2"/>
@@ -8052,8 +8103,8 @@
         </w:pict>
       </w:r>
     </w:p>
-    <w:bookmarkEnd w:id="137"/>
-    <w:bookmarkStart w:id="138" w:name="academic-integrity"/>
+    <w:bookmarkEnd w:id="142"/>
+    <w:bookmarkStart w:id="143" w:name="academic-integrity"/>
     <w:p>
       <w:pPr>
         <w:pStyle w:val="Heading2"/>
@@ -8093,8 +8144,8 @@
         </w:pict>
       </w:r>
     </w:p>
-    <w:bookmarkEnd w:id="138"/>
-    <w:bookmarkStart w:id="139" w:name="using-ai-tools-chatgpt"/>
+    <w:bookmarkEnd w:id="143"/>
+    <w:bookmarkStart w:id="144" w:name="using-ai-tools-chatgpt"/>
     <w:p>
       <w:pPr>
         <w:pStyle w:val="Heading2"/>
@@ -8203,8 +8254,8 @@
         </w:pict>
       </w:r>
     </w:p>
-    <w:bookmarkEnd w:id="139"/>
-    <w:bookmarkStart w:id="140" w:name="catalog-statement"/>
+    <w:bookmarkEnd w:id="144"/>
+    <w:bookmarkStart w:id="145" w:name="catalog-statement"/>
     <w:p>
       <w:pPr>
         <w:pStyle w:val="Heading2"/>
@@ -8228,8 +8279,8 @@
         </w:pict>
       </w:r>
     </w:p>
-    <w:bookmarkEnd w:id="140"/>
-    <w:bookmarkStart w:id="141" w:name="cece-workshops-events"/>
+    <w:bookmarkEnd w:id="145"/>
+    <w:bookmarkStart w:id="146" w:name="cece-workshops-events"/>
     <w:p>
       <w:pPr>
         <w:pStyle w:val="Heading2"/>
@@ -8261,8 +8312,8 @@
         </w:pict>
       </w:r>
     </w:p>
-    <w:bookmarkEnd w:id="141"/>
-    <w:bookmarkStart w:id="161" w:name="related-files"/>
+    <w:bookmarkEnd w:id="146"/>
+    <w:bookmarkStart w:id="166" w:name="related-files"/>
     <w:p>
       <w:pPr>
         <w:pStyle w:val="Heading2"/>
@@ -8271,7 +8322,7 @@
         <w:t xml:space="preserve">Related Files</w:t>
       </w:r>
     </w:p>
-    <w:bookmarkStart w:id="144" w:name="rubrics-guidelines"/>
+    <w:bookmarkStart w:id="149" w:name="rubrics-guidelines"/>
     <w:p>
       <w:pPr>
         <w:pStyle w:val="Heading3"/>
@@ -8287,7 +8338,7 @@
           <w:numId w:val="1010"/>
         </w:numPr>
       </w:pPr>
-      <w:hyperlink r:id="rId142">
+      <w:hyperlink r:id="rId147">
         <w:r>
           <w:rPr>
             <w:rStyle w:val="Hyperlink"/>
@@ -8311,7 +8362,7 @@
           <w:numId w:val="1010"/>
         </w:numPr>
       </w:pPr>
-      <w:hyperlink r:id="rId143">
+      <w:hyperlink r:id="rId148">
         <w:r>
           <w:rPr>
             <w:rStyle w:val="Hyperlink"/>
@@ -8328,8 +8379,8 @@
         <w:t xml:space="preserve">- Instructions and grading criteria for team meetings</w:t>
       </w:r>
     </w:p>
-    <w:bookmarkEnd w:id="144"/>
-    <w:bookmarkStart w:id="156" w:name="team-meeting-agendas"/>
+    <w:bookmarkEnd w:id="149"/>
+    <w:bookmarkStart w:id="161" w:name="team-meeting-agendas"/>
     <w:p>
       <w:pPr>
         <w:pStyle w:val="Heading3"/>
@@ -8345,7 +8396,7 @@
           <w:numId w:val="1011"/>
         </w:numPr>
       </w:pPr>
-      <w:hyperlink r:id="rId145">
+      <w:hyperlink r:id="rId150">
         <w:r>
           <w:rPr>
             <w:rStyle w:val="Hyperlink"/>
@@ -8369,7 +8420,7 @@
           <w:numId w:val="1011"/>
         </w:numPr>
       </w:pPr>
-      <w:hyperlink r:id="rId146">
+      <w:hyperlink r:id="rId151">
         <w:r>
           <w:rPr>
             <w:rStyle w:val="Hyperlink"/>
@@ -8393,7 +8444,7 @@
           <w:numId w:val="1011"/>
         </w:numPr>
       </w:pPr>
-      <w:hyperlink r:id="rId147">
+      <w:hyperlink r:id="rId152">
         <w:r>
           <w:rPr>
             <w:rStyle w:val="Hyperlink"/>
@@ -8417,7 +8468,7 @@
           <w:numId w:val="1011"/>
         </w:numPr>
       </w:pPr>
-      <w:hyperlink r:id="rId148">
+      <w:hyperlink r:id="rId153">
         <w:r>
           <w:rPr>
             <w:rStyle w:val="Hyperlink"/>
@@ -8441,7 +8492,7 @@
           <w:numId w:val="1011"/>
         </w:numPr>
       </w:pPr>
-      <w:hyperlink r:id="rId149">
+      <w:hyperlink r:id="rId154">
         <w:r>
           <w:rPr>
             <w:rStyle w:val="Hyperlink"/>
@@ -8465,7 +8516,7 @@
           <w:numId w:val="1011"/>
         </w:numPr>
       </w:pPr>
-      <w:hyperlink r:id="rId150">
+      <w:hyperlink r:id="rId155">
         <w:r>
           <w:rPr>
             <w:rStyle w:val="Hyperlink"/>
@@ -8489,7 +8540,7 @@
           <w:numId w:val="1011"/>
         </w:numPr>
       </w:pPr>
-      <w:hyperlink r:id="rId151">
+      <w:hyperlink r:id="rId156">
         <w:r>
           <w:rPr>
             <w:rStyle w:val="Hyperlink"/>
@@ -8513,7 +8564,7 @@
           <w:numId w:val="1011"/>
         </w:numPr>
       </w:pPr>
-      <w:hyperlink r:id="rId152">
+      <w:hyperlink r:id="rId157">
         <w:r>
           <w:rPr>
             <w:rStyle w:val="Hyperlink"/>
@@ -8537,7 +8588,7 @@
           <w:numId w:val="1011"/>
         </w:numPr>
       </w:pPr>
-      <w:hyperlink r:id="rId153">
+      <w:hyperlink r:id="rId158">
         <w:r>
           <w:rPr>
             <w:rStyle w:val="Hyperlink"/>
@@ -8561,7 +8612,7 @@
           <w:numId w:val="1011"/>
         </w:numPr>
       </w:pPr>
-      <w:hyperlink r:id="rId154">
+      <w:hyperlink r:id="rId159">
         <w:r>
           <w:rPr>
             <w:rStyle w:val="Hyperlink"/>
@@ -8585,7 +8636,7 @@
           <w:numId w:val="1011"/>
         </w:numPr>
       </w:pPr>
-      <w:hyperlink r:id="rId155">
+      <w:hyperlink r:id="rId160">
         <w:r>
           <w:rPr>
             <w:rStyle w:val="Hyperlink"/>
@@ -8602,8 +8653,8 @@
         <w:t xml:space="preserve">- Week 15 (Last)</w:t>
       </w:r>
     </w:p>
-    <w:bookmarkEnd w:id="156"/>
-    <w:bookmarkStart w:id="158" w:name="schedules-rosters"/>
+    <w:bookmarkEnd w:id="161"/>
+    <w:bookmarkStart w:id="163" w:name="schedules-rosters"/>
     <w:p>
       <w:pPr>
         <w:pStyle w:val="Heading3"/>
@@ -8620,7 +8671,7 @@
           <w:numId w:val="1012"/>
         </w:numPr>
       </w:pPr>
-      <w:hyperlink r:id="rId157">
+      <w:hyperlink r:id="rId162">
         <w:r>
           <w:rPr>
             <w:rStyle w:val="Hyperlink"/>
@@ -8637,8 +8688,8 @@
         <w:t xml:space="preserve">- Class roster and team assignments</w:t>
       </w:r>
     </w:p>
-    <w:bookmarkEnd w:id="158"/>
-    <w:bookmarkStart w:id="160" w:name="external-links"/>
+    <w:bookmarkEnd w:id="163"/>
+    <w:bookmarkStart w:id="165" w:name="external-links"/>
     <w:p>
       <w:pPr>
         <w:pStyle w:val="Heading3"/>
@@ -8726,7 +8777,7 @@
           <w:numId w:val="1013"/>
         </w:numPr>
       </w:pPr>
-      <w:hyperlink r:id="rId159">
+      <w:hyperlink r:id="rId164">
         <w:r>
           <w:rPr>
             <w:rStyle w:val="Hyperlink"/>
@@ -8743,8 +8794,8 @@
         <w:t xml:space="preserve">- Editable syllabus document</w:t>
       </w:r>
     </w:p>
-    <w:bookmarkEnd w:id="160"/>
-    <w:bookmarkEnd w:id="161"/>
+    <w:bookmarkEnd w:id="165"/>
+    <w:bookmarkEnd w:id="166"/>
     <w:sectPr>
       <w:footnotePr>
         <w:numRestart w:val="eachSect"/>

</xml_diff>

<commit_message>
Add AI Training from Email Patterns activity page and link in syllabus
New activity page for Ch 8 Training HR. Added link to 3/19 class
session and Activities section in index.

Co-Authored-By: Claude Opus 4.6 (1M context) <noreply@anthropic.com>
</commit_message>
<xml_diff>
--- a/Syllabus.docx
+++ b/Syllabus.docx
@@ -3439,7 +3439,7 @@
     </w:p>
     <w:bookmarkEnd w:id="48"/>
     <w:bookmarkEnd w:id="49"/>
-    <w:bookmarkStart w:id="137" w:name="course-agenda"/>
+    <w:bookmarkStart w:id="122" w:name="course-agenda"/>
     <w:p>
       <w:pPr>
         <w:pStyle w:val="Heading2"/>
@@ -3985,43 +3985,51 @@
             <w:r>
               <w:t xml:space="preserve"> </w:t>
             </w:r>
+            <w:r>
+              <w:t xml:space="preserve">[Slide]</w:t>
+              <w:br/>
+              <w:t xml:space="preserve">→ Presenters</w:t>
+            </w:r>
+            <w:r>
+              <w:t xml:space="preserve"> </w:t>
+            </w:r>
+            <w:hyperlink r:id="rId32">
+              <w:r>
+                <w:rPr>
+                  <w:rStyle w:val="Hyperlink"/>
+                  <w:color w:val="0066CC"/>
+                  <w:u w:val="single"/>
+                </w:rPr>
+                <w:t xml:space="preserve">Rubric</w:t>
+              </w:r>
+            </w:hyperlink>
+            <w:r>
+              <w:t xml:space="preserve">: Create a slide and prepare for a presentation (Due: Before class starts)</w:t>
+              <w:br/>
+              <w:t xml:space="preserve">→ Peer Assessment</w:t>
+            </w:r>
+            <w:r>
+              <w:t xml:space="preserve"> </w:t>
+            </w:r>
+            <w:hyperlink r:id="rId53">
+              <w:r>
+                <w:rPr>
+                  <w:rStyle w:val="Hyperlink"/>
+                  <w:color w:val="0066CC"/>
+                  <w:u w:val="single"/>
+                </w:rPr>
+                <w:t xml:space="preserve">Link</w:t>
+              </w:r>
+            </w:hyperlink>
+            <w:r>
+              <w:t xml:space="preserve"/>
+              <w:br/>
+              <w:t xml:space="preserve">→ Instructor Feedback Slides</w:t>
+            </w:r>
+            <w:r>
+              <w:t xml:space="preserve"> </w:t>
+            </w:r>
             <w:hyperlink r:id="rId62">
-              <w:r>
-                <w:rPr>
-                  <w:rStyle w:val="Hyperlink"/>
-                  <w:color w:val="0066CC"/>
-                  <w:u w:val="single"/>
-                </w:rPr>
-                <w:t xml:space="preserve">Slide</w:t>
-              </w:r>
-            </w:hyperlink>
-            <w:r>
-              <w:t xml:space="preserve"/>
-              <w:br/>
-              <w:t xml:space="preserve">→ Presenters</w:t>
-            </w:r>
-            <w:r>
-              <w:t xml:space="preserve"> </w:t>
-            </w:r>
-            <w:hyperlink r:id="rId32">
-              <w:r>
-                <w:rPr>
-                  <w:rStyle w:val="Hyperlink"/>
-                  <w:color w:val="0066CC"/>
-                  <w:u w:val="single"/>
-                </w:rPr>
-                <w:t xml:space="preserve">Rubric</w:t>
-              </w:r>
-            </w:hyperlink>
-            <w:r>
-              <w:t xml:space="preserve">: Create a slide and prepare for a presentation (Due: Before class starts)</w:t>
-              <w:br/>
-              <w:t xml:space="preserve">→ Peer Assessment</w:t>
-            </w:r>
-            <w:r>
-              <w:t xml:space="preserve"> </w:t>
-            </w:r>
-            <w:hyperlink r:id="rId53">
               <w:r>
                 <w:rPr>
                   <w:rStyle w:val="Hyperlink"/>
@@ -4070,18 +4078,7 @@
             </w:pPr>
             <w:r>
               <w:t xml:space="preserve">1/29 Thu</w:t>
-              <w:br/>
-            </w:r>
-            <w:hyperlink r:id="rId63">
-              <w:r>
-                <w:rPr>
-                  <w:rStyle w:val="Hyperlink"/>
-                  <w:color w:val="0066CC"/>
-                  <w:u w:val="single"/>
-                </w:rPr>
-                <w:t xml:space="preserve">Recording</w:t>
-              </w:r>
-            </w:hyperlink>
+            </w:r>
           </w:p>
         </w:tc>
         <w:tc>
@@ -4102,7 +4099,7 @@
             <w:r>
               <w:t xml:space="preserve"> </w:t>
             </w:r>
-            <w:hyperlink r:id="rId64">
+            <w:hyperlink r:id="rId63">
               <w:r>
                 <w:rPr>
                   <w:rStyle w:val="Hyperlink"/>
@@ -4215,18 +4212,7 @@
             </w:pPr>
             <w:r>
               <w:t xml:space="preserve">2/03 Tue</w:t>
-              <w:br/>
-            </w:r>
-            <w:hyperlink r:id="rId65">
-              <w:r>
-                <w:rPr>
-                  <w:rStyle w:val="Hyperlink"/>
-                  <w:color w:val="0066CC"/>
-                  <w:u w:val="single"/>
-                </w:rPr>
-                <w:t xml:space="preserve">Recording</w:t>
-              </w:r>
-            </w:hyperlink>
+            </w:r>
           </w:p>
         </w:tc>
         <w:tc>
@@ -4247,7 +4233,7 @@
             <w:r>
               <w:t xml:space="preserve"> </w:t>
             </w:r>
-            <w:hyperlink r:id="rId66">
+            <w:hyperlink r:id="rId64">
               <w:r>
                 <w:rPr>
                   <w:rStyle w:val="Hyperlink"/>
@@ -4267,7 +4253,7 @@
             <w:r>
               <w:t xml:space="preserve"> </w:t>
             </w:r>
-            <w:hyperlink r:id="rId67">
+            <w:hyperlink r:id="rId65">
               <w:r>
                 <w:rPr>
                   <w:rStyle w:val="Hyperlink"/>
@@ -4304,7 +4290,7 @@
             <w:r>
               <w:t xml:space="preserve"> </w:t>
             </w:r>
-            <w:hyperlink r:id="rId68">
+            <w:hyperlink r:id="rId66">
               <w:r>
                 <w:rPr>
                   <w:rStyle w:val="Hyperlink"/>
@@ -4317,43 +4303,51 @@
             <w:r>
               <w:t xml:space="preserve"> </w:t>
             </w:r>
-            <w:hyperlink r:id="rId69">
-              <w:r>
-                <w:rPr>
-                  <w:rStyle w:val="Hyperlink"/>
-                  <w:color w:val="0066CC"/>
-                  <w:u w:val="single"/>
-                </w:rPr>
-                <w:t xml:space="preserve">Slide</w:t>
+            <w:r>
+              <w:t xml:space="preserve">[Slide]</w:t>
+              <w:br/>
+              <w:t xml:space="preserve">→ Presenters</w:t>
+            </w:r>
+            <w:r>
+              <w:t xml:space="preserve"> </w:t>
+            </w:r>
+            <w:hyperlink r:id="rId32">
+              <w:r>
+                <w:rPr>
+                  <w:rStyle w:val="Hyperlink"/>
+                  <w:color w:val="0066CC"/>
+                  <w:u w:val="single"/>
+                </w:rPr>
+                <w:t xml:space="preserve">Rubric</w:t>
+              </w:r>
+            </w:hyperlink>
+            <w:r>
+              <w:t xml:space="preserve">: Create a slide and prepare for a presentation (Due: Before class starts)</w:t>
+              <w:br/>
+              <w:t xml:space="preserve">→ Peer Assessment</w:t>
+            </w:r>
+            <w:r>
+              <w:t xml:space="preserve"> </w:t>
+            </w:r>
+            <w:hyperlink r:id="rId53">
+              <w:r>
+                <w:rPr>
+                  <w:rStyle w:val="Hyperlink"/>
+                  <w:color w:val="0066CC"/>
+                  <w:u w:val="single"/>
+                </w:rPr>
+                <w:t xml:space="preserve">Link</w:t>
               </w:r>
             </w:hyperlink>
             <w:r>
               <w:t xml:space="preserve"/>
               <w:br/>
-              <w:t xml:space="preserve">→ Presenters</w:t>
-            </w:r>
-            <w:r>
-              <w:t xml:space="preserve"> </w:t>
-            </w:r>
-            <w:hyperlink r:id="rId32">
-              <w:r>
-                <w:rPr>
-                  <w:rStyle w:val="Hyperlink"/>
-                  <w:color w:val="0066CC"/>
-                  <w:u w:val="single"/>
-                </w:rPr>
-                <w:t xml:space="preserve">Rubric</w:t>
-              </w:r>
-            </w:hyperlink>
-            <w:r>
-              <w:t xml:space="preserve">: Create a slide and prepare for a presentation (Due: Before class starts)</w:t>
-              <w:br/>
-              <w:t xml:space="preserve">→ Peer Assessment</w:t>
-            </w:r>
-            <w:r>
-              <w:t xml:space="preserve"> </w:t>
-            </w:r>
-            <w:hyperlink r:id="rId53">
+              <w:t xml:space="preserve">→ Instructor Feedback Slides</w:t>
+            </w:r>
+            <w:r>
+              <w:t xml:space="preserve"> </w:t>
+            </w:r>
+            <w:hyperlink r:id="rId62">
               <w:r>
                 <w:rPr>
                   <w:rStyle w:val="Hyperlink"/>
@@ -4402,18 +4396,7 @@
             </w:pPr>
             <w:r>
               <w:t xml:space="preserve">2/05 Thu</w:t>
-              <w:br/>
-            </w:r>
-            <w:hyperlink r:id="rId70">
-              <w:r>
-                <w:rPr>
-                  <w:rStyle w:val="Hyperlink"/>
-                  <w:color w:val="0066CC"/>
-                  <w:u w:val="single"/>
-                </w:rPr>
-                <w:t xml:space="preserve">Recording</w:t>
-              </w:r>
-            </w:hyperlink>
+            </w:r>
           </w:p>
         </w:tc>
         <w:tc>
@@ -4434,7 +4417,7 @@
             <w:r>
               <w:t xml:space="preserve"> </w:t>
             </w:r>
-            <w:hyperlink r:id="rId71">
+            <w:hyperlink r:id="rId67">
               <w:r>
                 <w:rPr>
                   <w:rStyle w:val="Hyperlink"/>
@@ -4527,7 +4510,7 @@
             <w:r>
               <w:t xml:space="preserve"> </w:t>
             </w:r>
-            <w:hyperlink r:id="rId72">
+            <w:hyperlink r:id="rId68">
               <w:r>
                 <w:rPr>
                   <w:rStyle w:val="Hyperlink"/>
@@ -4547,7 +4530,7 @@
             <w:r>
               <w:t xml:space="preserve"> </w:t>
             </w:r>
-            <w:hyperlink r:id="rId73">
+            <w:hyperlink r:id="rId69">
               <w:r>
                 <w:rPr>
                   <w:rStyle w:val="Hyperlink"/>
@@ -4584,7 +4567,7 @@
             <w:r>
               <w:t xml:space="preserve"> </w:t>
             </w:r>
-            <w:hyperlink r:id="rId74">
+            <w:hyperlink r:id="rId70">
               <w:r>
                 <w:rPr>
                   <w:rStyle w:val="Hyperlink"/>
@@ -4597,43 +4580,51 @@
             <w:r>
               <w:t xml:space="preserve"> </w:t>
             </w:r>
-            <w:hyperlink r:id="rId75">
-              <w:r>
-                <w:rPr>
-                  <w:rStyle w:val="Hyperlink"/>
-                  <w:color w:val="0066CC"/>
-                  <w:u w:val="single"/>
-                </w:rPr>
-                <w:t xml:space="preserve">Slide</w:t>
+            <w:r>
+              <w:t xml:space="preserve">[Slide]</w:t>
+              <w:br/>
+              <w:t xml:space="preserve">→ Presenters</w:t>
+            </w:r>
+            <w:r>
+              <w:t xml:space="preserve"> </w:t>
+            </w:r>
+            <w:hyperlink r:id="rId32">
+              <w:r>
+                <w:rPr>
+                  <w:rStyle w:val="Hyperlink"/>
+                  <w:color w:val="0066CC"/>
+                  <w:u w:val="single"/>
+                </w:rPr>
+                <w:t xml:space="preserve">Rubric</w:t>
+              </w:r>
+            </w:hyperlink>
+            <w:r>
+              <w:t xml:space="preserve">: Create a slide and prepare for a presentation (Due: Before class starts)</w:t>
+              <w:br/>
+              <w:t xml:space="preserve">→ Peer Assessment</w:t>
+            </w:r>
+            <w:r>
+              <w:t xml:space="preserve"> </w:t>
+            </w:r>
+            <w:hyperlink r:id="rId53">
+              <w:r>
+                <w:rPr>
+                  <w:rStyle w:val="Hyperlink"/>
+                  <w:color w:val="0066CC"/>
+                  <w:u w:val="single"/>
+                </w:rPr>
+                <w:t xml:space="preserve">Link</w:t>
               </w:r>
             </w:hyperlink>
             <w:r>
               <w:t xml:space="preserve"/>
               <w:br/>
-              <w:t xml:space="preserve">→ Presenters</w:t>
-            </w:r>
-            <w:r>
-              <w:t xml:space="preserve"> </w:t>
-            </w:r>
-            <w:hyperlink r:id="rId32">
-              <w:r>
-                <w:rPr>
-                  <w:rStyle w:val="Hyperlink"/>
-                  <w:color w:val="0066CC"/>
-                  <w:u w:val="single"/>
-                </w:rPr>
-                <w:t xml:space="preserve">Rubric</w:t>
-              </w:r>
-            </w:hyperlink>
-            <w:r>
-              <w:t xml:space="preserve">: Create a slide and prepare for a presentation (Due: Before class starts)</w:t>
-              <w:br/>
-              <w:t xml:space="preserve">→ Peer Assessment</w:t>
-            </w:r>
-            <w:r>
-              <w:t xml:space="preserve"> </w:t>
-            </w:r>
-            <w:hyperlink r:id="rId53">
+              <w:t xml:space="preserve">→ Instructor Feedback Slides</w:t>
+            </w:r>
+            <w:r>
+              <w:t xml:space="preserve"> </w:t>
+            </w:r>
+            <w:hyperlink r:id="rId62">
               <w:r>
                 <w:rPr>
                   <w:rStyle w:val="Hyperlink"/>
@@ -4684,7 +4675,7 @@
             <w:r>
               <w:t xml:space="preserve"> </w:t>
             </w:r>
-            <w:hyperlink r:id="rId76">
+            <w:hyperlink r:id="rId71">
               <w:r>
                 <w:rPr>
                   <w:rStyle w:val="Hyperlink"/>
@@ -4702,7 +4693,7 @@
             <w:r>
               <w:t xml:space="preserve"> </w:t>
             </w:r>
-            <w:hyperlink r:id="rId77">
+            <w:hyperlink r:id="rId72">
               <w:r>
                 <w:rPr>
                   <w:rStyle w:val="Hyperlink"/>
@@ -4718,7 +4709,7 @@
             <w:r>
               <w:t xml:space="preserve"> </w:t>
             </w:r>
-            <w:hyperlink r:id="rId78">
+            <w:hyperlink r:id="rId73">
               <w:r>
                 <w:rPr>
                   <w:rStyle w:val="Hyperlink"/>
@@ -4767,18 +4758,7 @@
             </w:pPr>
             <w:r>
               <w:t xml:space="preserve">2/12 Thu</w:t>
-              <w:br/>
-            </w:r>
-            <w:hyperlink r:id="rId79">
-              <w:r>
-                <w:rPr>
-                  <w:rStyle w:val="Hyperlink"/>
-                  <w:color w:val="0066CC"/>
-                  <w:u w:val="single"/>
-                </w:rPr>
-                <w:t xml:space="preserve">Recording</w:t>
-              </w:r>
-            </w:hyperlink>
+            </w:r>
           </w:p>
         </w:tc>
         <w:tc>
@@ -4799,7 +4779,7 @@
             <w:r>
               <w:t xml:space="preserve"> </w:t>
             </w:r>
-            <w:hyperlink r:id="rId80">
+            <w:hyperlink r:id="rId74">
               <w:r>
                 <w:rPr>
                   <w:rStyle w:val="Hyperlink"/>
@@ -4871,18 +4851,7 @@
             </w:pPr>
             <w:r>
               <w:t xml:space="preserve">2/17 Tue</w:t>
-              <w:br/>
-            </w:r>
-            <w:hyperlink r:id="rId81">
-              <w:r>
-                <w:rPr>
-                  <w:rStyle w:val="Hyperlink"/>
-                  <w:color w:val="0066CC"/>
-                  <w:u w:val="single"/>
-                </w:rPr>
-                <w:t xml:space="preserve">Recording</w:t>
-              </w:r>
-            </w:hyperlink>
+            </w:r>
           </w:p>
         </w:tc>
         <w:tc>
@@ -4903,7 +4872,7 @@
             <w:r>
               <w:t xml:space="preserve"> </w:t>
             </w:r>
-            <w:hyperlink r:id="rId82">
+            <w:hyperlink r:id="rId75">
               <w:r>
                 <w:rPr>
                   <w:rStyle w:val="Hyperlink"/>
@@ -4923,7 +4892,7 @@
             <w:r>
               <w:t xml:space="preserve"> </w:t>
             </w:r>
-            <w:hyperlink r:id="rId83">
+            <w:hyperlink r:id="rId76">
               <w:r>
                 <w:rPr>
                   <w:rStyle w:val="Hyperlink"/>
@@ -4959,7 +4928,7 @@
               <w:t xml:space="preserve">- Continues on 2/19</w:t>
               <w:br/>
             </w:r>
-            <w:hyperlink r:id="rId84">
+            <w:hyperlink r:id="rId77">
               <w:r>
                 <w:rPr>
                   <w:rStyle w:val="Hyperlink"/>
@@ -4975,7 +4944,7 @@
             <w:r>
               <w:t xml:space="preserve"> </w:t>
             </w:r>
-            <w:hyperlink r:id="rId85">
+            <w:hyperlink r:id="rId78">
               <w:r>
                 <w:rPr>
                   <w:rStyle w:val="Hyperlink"/>
@@ -5027,18 +4996,7 @@
             </w:pPr>
             <w:r>
               <w:t xml:space="preserve">2/19 Thu</w:t>
-              <w:br/>
-            </w:r>
-            <w:hyperlink r:id="rId86">
-              <w:r>
-                <w:rPr>
-                  <w:rStyle w:val="Hyperlink"/>
-                  <w:color w:val="0066CC"/>
-                  <w:u w:val="single"/>
-                </w:rPr>
-                <w:t xml:space="preserve">Recording</w:t>
-              </w:r>
-            </w:hyperlink>
+            </w:r>
           </w:p>
         </w:tc>
         <w:tc>
@@ -5054,7 +5012,7 @@
                 <w:b/>
                 <w:bCs/>
               </w:rPr>
-              <w:t xml:space="preserve">Activity 3: Hiring with Numbers - A Regression Analysis Exercise, Part 2</w:t>
+              <w:t xml:space="preserve">Activity 3: Hiring with Numbers - A Regression Analysis Exercise, Part 1</w:t>
             </w:r>
             <w:r>
               <w:t xml:space="preserve"> </w:t>
@@ -5098,18 +5056,7 @@
             </w:pPr>
             <w:r>
               <w:t xml:space="preserve">2/24 Tue</w:t>
-              <w:br/>
-            </w:r>
-            <w:hyperlink r:id="rId87">
-              <w:r>
-                <w:rPr>
-                  <w:rStyle w:val="Hyperlink"/>
-                  <w:color w:val="0066CC"/>
-                  <w:u w:val="single"/>
-                </w:rPr>
-                <w:t xml:space="preserve">Recording</w:t>
-              </w:r>
-            </w:hyperlink>
+            </w:r>
           </w:p>
         </w:tc>
         <w:tc>
@@ -5130,7 +5077,7 @@
             <w:r>
               <w:t xml:space="preserve"> </w:t>
             </w:r>
-            <w:hyperlink r:id="rId88">
+            <w:hyperlink r:id="rId79">
               <w:r>
                 <w:rPr>
                   <w:rStyle w:val="Hyperlink"/>
@@ -5150,7 +5097,7 @@
             <w:r>
               <w:t xml:space="preserve"> </w:t>
             </w:r>
-            <w:hyperlink r:id="rId89">
+            <w:hyperlink r:id="rId80">
               <w:r>
                 <w:rPr>
                   <w:rStyle w:val="Hyperlink"/>
@@ -5187,7 +5134,7 @@
             <w:r>
               <w:t xml:space="preserve"> </w:t>
             </w:r>
-            <w:hyperlink r:id="rId90">
+            <w:hyperlink r:id="rId81">
               <w:r>
                 <w:rPr>
                   <w:rStyle w:val="Hyperlink"/>
@@ -5200,43 +5147,51 @@
             <w:r>
               <w:t xml:space="preserve"> </w:t>
             </w:r>
-            <w:hyperlink r:id="rId91">
-              <w:r>
-                <w:rPr>
-                  <w:rStyle w:val="Hyperlink"/>
-                  <w:color w:val="0066CC"/>
-                  <w:u w:val="single"/>
-                </w:rPr>
-                <w:t xml:space="preserve">Slide</w:t>
+            <w:r>
+              <w:t xml:space="preserve">[Slide]</w:t>
+              <w:br/>
+              <w:t xml:space="preserve">→ Presenters</w:t>
+            </w:r>
+            <w:r>
+              <w:t xml:space="preserve"> </w:t>
+            </w:r>
+            <w:hyperlink r:id="rId32">
+              <w:r>
+                <w:rPr>
+                  <w:rStyle w:val="Hyperlink"/>
+                  <w:color w:val="0066CC"/>
+                  <w:u w:val="single"/>
+                </w:rPr>
+                <w:t xml:space="preserve">Rubric</w:t>
+              </w:r>
+            </w:hyperlink>
+            <w:r>
+              <w:t xml:space="preserve">: Create a slide and prepare for a presentation (Due: Before class starts)</w:t>
+              <w:br/>
+              <w:t xml:space="preserve">→ Peer Assessment</w:t>
+            </w:r>
+            <w:r>
+              <w:t xml:space="preserve"> </w:t>
+            </w:r>
+            <w:hyperlink r:id="rId53">
+              <w:r>
+                <w:rPr>
+                  <w:rStyle w:val="Hyperlink"/>
+                  <w:color w:val="0066CC"/>
+                  <w:u w:val="single"/>
+                </w:rPr>
+                <w:t xml:space="preserve">Link</w:t>
               </w:r>
             </w:hyperlink>
             <w:r>
               <w:t xml:space="preserve"/>
               <w:br/>
-              <w:t xml:space="preserve">→ Presenters</w:t>
-            </w:r>
-            <w:r>
-              <w:t xml:space="preserve"> </w:t>
-            </w:r>
-            <w:hyperlink r:id="rId32">
-              <w:r>
-                <w:rPr>
-                  <w:rStyle w:val="Hyperlink"/>
-                  <w:color w:val="0066CC"/>
-                  <w:u w:val="single"/>
-                </w:rPr>
-                <w:t xml:space="preserve">Rubric</w:t>
-              </w:r>
-            </w:hyperlink>
-            <w:r>
-              <w:t xml:space="preserve">: Create a slide and prepare for a presentation (Due: Before class starts)</w:t>
-              <w:br/>
-              <w:t xml:space="preserve">→ Peer Assessment</w:t>
-            </w:r>
-            <w:r>
-              <w:t xml:space="preserve"> </w:t>
-            </w:r>
-            <w:hyperlink r:id="rId53">
+              <w:t xml:space="preserve">→ Instructor Feedback Slides</w:t>
+            </w:r>
+            <w:r>
+              <w:t xml:space="preserve"> </w:t>
+            </w:r>
+            <w:hyperlink r:id="rId62">
               <w:r>
                 <w:rPr>
                   <w:rStyle w:val="Hyperlink"/>
@@ -5285,18 +5240,7 @@
             </w:pPr>
             <w:r>
               <w:t xml:space="preserve">2/26 Thu</w:t>
-              <w:br/>
-            </w:r>
-            <w:hyperlink r:id="rId92">
-              <w:r>
-                <w:rPr>
-                  <w:rStyle w:val="Hyperlink"/>
-                  <w:color w:val="0066CC"/>
-                  <w:u w:val="single"/>
-                </w:rPr>
-                <w:t xml:space="preserve">Recording</w:t>
-              </w:r>
-            </w:hyperlink>
+            </w:r>
           </w:p>
         </w:tc>
         <w:tc>
@@ -5317,7 +5261,7 @@
             <w:r>
               <w:t xml:space="preserve"> </w:t>
             </w:r>
-            <w:hyperlink r:id="rId93">
+            <w:hyperlink r:id="rId82">
               <w:r>
                 <w:rPr>
                   <w:rStyle w:val="Hyperlink"/>
@@ -5430,18 +5374,7 @@
             </w:pPr>
             <w:r>
               <w:t xml:space="preserve">3/05 Thu</w:t>
-              <w:br/>
-            </w:r>
-            <w:hyperlink r:id="rId94">
-              <w:r>
-                <w:rPr>
-                  <w:rStyle w:val="Hyperlink"/>
-                  <w:color w:val="0066CC"/>
-                  <w:u w:val="single"/>
-                </w:rPr>
-                <w:t xml:space="preserve">Recording</w:t>
-              </w:r>
-            </w:hyperlink>
+            </w:r>
           </w:p>
         </w:tc>
         <w:tc>
@@ -5463,7 +5396,7 @@
               <w:t xml:space="preserve"/>
               <w:br/>
             </w:r>
-            <w:hyperlink r:id="rId95">
+            <w:hyperlink r:id="rId83">
               <w:r>
                 <w:rPr>
                   <w:rStyle w:val="Hyperlink"/>
@@ -5511,18 +5444,7 @@
             </w:pPr>
             <w:r>
               <w:t xml:space="preserve">3/10 Tue</w:t>
-              <w:br/>
-            </w:r>
-            <w:hyperlink r:id="rId96">
-              <w:r>
-                <w:rPr>
-                  <w:rStyle w:val="Hyperlink"/>
-                  <w:color w:val="0066CC"/>
-                  <w:u w:val="single"/>
-                </w:rPr>
-                <w:t xml:space="preserve">Recording</w:t>
-              </w:r>
-            </w:hyperlink>
+            </w:r>
           </w:p>
         </w:tc>
         <w:tc>
@@ -5543,7 +5465,7 @@
             <w:r>
               <w:t xml:space="preserve"> </w:t>
             </w:r>
-            <w:hyperlink r:id="rId97">
+            <w:hyperlink r:id="rId84">
               <w:r>
                 <w:rPr>
                   <w:rStyle w:val="Hyperlink"/>
@@ -5563,7 +5485,7 @@
             <w:r>
               <w:t xml:space="preserve"> </w:t>
             </w:r>
-            <w:hyperlink r:id="rId98">
+            <w:hyperlink r:id="rId85">
               <w:r>
                 <w:rPr>
                   <w:rStyle w:val="Hyperlink"/>
@@ -5600,7 +5522,7 @@
             <w:r>
               <w:t xml:space="preserve"> </w:t>
             </w:r>
-            <w:hyperlink r:id="rId99">
+            <w:hyperlink r:id="rId86">
               <w:r>
                 <w:rPr>
                   <w:rStyle w:val="Hyperlink"/>
@@ -5613,43 +5535,51 @@
             <w:r>
               <w:t xml:space="preserve"> </w:t>
             </w:r>
-            <w:hyperlink r:id="rId100">
-              <w:r>
-                <w:rPr>
-                  <w:rStyle w:val="Hyperlink"/>
-                  <w:color w:val="0066CC"/>
-                  <w:u w:val="single"/>
-                </w:rPr>
-                <w:t xml:space="preserve">Slide</w:t>
+            <w:r>
+              <w:t xml:space="preserve">[Slide]</w:t>
+              <w:br/>
+              <w:t xml:space="preserve">→ Presenters</w:t>
+            </w:r>
+            <w:r>
+              <w:t xml:space="preserve"> </w:t>
+            </w:r>
+            <w:hyperlink r:id="rId32">
+              <w:r>
+                <w:rPr>
+                  <w:rStyle w:val="Hyperlink"/>
+                  <w:color w:val="0066CC"/>
+                  <w:u w:val="single"/>
+                </w:rPr>
+                <w:t xml:space="preserve">Rubric</w:t>
+              </w:r>
+            </w:hyperlink>
+            <w:r>
+              <w:t xml:space="preserve">: Create a slide and prepare for a presentation (Due: Before class starts)</w:t>
+              <w:br/>
+              <w:t xml:space="preserve">→ Peer Assessment</w:t>
+            </w:r>
+            <w:r>
+              <w:t xml:space="preserve"> </w:t>
+            </w:r>
+            <w:hyperlink r:id="rId53">
+              <w:r>
+                <w:rPr>
+                  <w:rStyle w:val="Hyperlink"/>
+                  <w:color w:val="0066CC"/>
+                  <w:u w:val="single"/>
+                </w:rPr>
+                <w:t xml:space="preserve">Link</w:t>
               </w:r>
             </w:hyperlink>
             <w:r>
               <w:t xml:space="preserve"/>
               <w:br/>
-              <w:t xml:space="preserve">→ Presenters</w:t>
-            </w:r>
-            <w:r>
-              <w:t xml:space="preserve"> </w:t>
-            </w:r>
-            <w:hyperlink r:id="rId32">
-              <w:r>
-                <w:rPr>
-                  <w:rStyle w:val="Hyperlink"/>
-                  <w:color w:val="0066CC"/>
-                  <w:u w:val="single"/>
-                </w:rPr>
-                <w:t xml:space="preserve">Rubric</w:t>
-              </w:r>
-            </w:hyperlink>
-            <w:r>
-              <w:t xml:space="preserve">: Create a slide and prepare for a presentation (Due: Before class starts)</w:t>
-              <w:br/>
-              <w:t xml:space="preserve">→ Peer Assessment</w:t>
-            </w:r>
-            <w:r>
-              <w:t xml:space="preserve"> </w:t>
-            </w:r>
-            <w:hyperlink r:id="rId53">
+              <w:t xml:space="preserve">→ Instructor Feedback Slides</w:t>
+            </w:r>
+            <w:r>
+              <w:t xml:space="preserve"> </w:t>
+            </w:r>
+            <w:hyperlink r:id="rId62">
               <w:r>
                 <w:rPr>
                   <w:rStyle w:val="Hyperlink"/>
@@ -5714,12 +5644,12 @@
                 <w:b/>
                 <w:bCs/>
               </w:rPr>
-              <w:t xml:space="preserve">Watch: Employment Law - Background Checks</w:t>
-            </w:r>
-            <w:r>
-              <w:t xml:space="preserve"> </w:t>
-            </w:r>
-            <w:hyperlink r:id="rId101">
+              <w:t xml:space="preserve">🖥️ ONLINE CLASS (Zoom)</w:t>
+            </w:r>
+            <w:r>
+              <w:t xml:space="preserve"> </w:t>
+            </w:r>
+            <w:hyperlink r:id="rId87">
               <w:r>
                 <w:rPr>
                   <w:rStyle w:val="Hyperlink"/>
@@ -5731,8 +5661,6 @@
             </w:hyperlink>
             <w:r>
               <w:t xml:space="preserve"/>
-              <w:br/>
-              <w:t xml:space="preserve">⚠️ This video will be included in the Final Exam I.</w:t>
               <w:br/>
               <w:br/>
             </w:r>
@@ -5746,7 +5674,7 @@
             <w:r>
               <w:t xml:space="preserve"> </w:t>
             </w:r>
-            <w:hyperlink r:id="rId102">
+            <w:hyperlink r:id="rId88">
               <w:r>
                 <w:rPr>
                   <w:rStyle w:val="Hyperlink"/>
@@ -5818,7 +5746,18 @@
             </w:pPr>
             <w:r>
               <w:t xml:space="preserve">3/17 Tue</w:t>
-            </w:r>
+              <w:br/>
+            </w:r>
+            <w:hyperlink r:id="rId89">
+              <w:r>
+                <w:rPr>
+                  <w:rStyle w:val="Hyperlink"/>
+                  <w:color w:val="0066CC"/>
+                  <w:u w:val="single"/>
+                </w:rPr>
+                <w:t xml:space="preserve">Recording</w:t>
+              </w:r>
+            </w:hyperlink>
           </w:p>
         </w:tc>
         <w:tc>
@@ -5839,7 +5778,7 @@
             <w:r>
               <w:t xml:space="preserve"> </w:t>
             </w:r>
-            <w:hyperlink r:id="rId103">
+            <w:hyperlink r:id="rId90">
               <w:r>
                 <w:rPr>
                   <w:rStyle w:val="Hyperlink"/>
@@ -5859,7 +5798,7 @@
             <w:r>
               <w:t xml:space="preserve"> </w:t>
             </w:r>
-            <w:hyperlink r:id="rId104">
+            <w:hyperlink r:id="rId91">
               <w:r>
                 <w:rPr>
                   <w:rStyle w:val="Hyperlink"/>
@@ -5896,7 +5835,7 @@
             <w:r>
               <w:t xml:space="preserve"> </w:t>
             </w:r>
-            <w:hyperlink r:id="rId105">
+            <w:hyperlink r:id="rId92">
               <w:r>
                 <w:rPr>
                   <w:rStyle w:val="Hyperlink"/>
@@ -5909,43 +5848,51 @@
             <w:r>
               <w:t xml:space="preserve"> </w:t>
             </w:r>
-            <w:hyperlink r:id="rId106">
-              <w:r>
-                <w:rPr>
-                  <w:rStyle w:val="Hyperlink"/>
-                  <w:color w:val="0066CC"/>
-                  <w:u w:val="single"/>
-                </w:rPr>
-                <w:t xml:space="preserve">Slide</w:t>
+            <w:r>
+              <w:t xml:space="preserve">[Slide]</w:t>
+              <w:br/>
+              <w:t xml:space="preserve">→ Presenters</w:t>
+            </w:r>
+            <w:r>
+              <w:t xml:space="preserve"> </w:t>
+            </w:r>
+            <w:hyperlink r:id="rId32">
+              <w:r>
+                <w:rPr>
+                  <w:rStyle w:val="Hyperlink"/>
+                  <w:color w:val="0066CC"/>
+                  <w:u w:val="single"/>
+                </w:rPr>
+                <w:t xml:space="preserve">Rubric</w:t>
+              </w:r>
+            </w:hyperlink>
+            <w:r>
+              <w:t xml:space="preserve">: Create a slide and prepare for a presentation (Due: Before class starts)</w:t>
+              <w:br/>
+              <w:t xml:space="preserve">→ Peer Assessment</w:t>
+            </w:r>
+            <w:r>
+              <w:t xml:space="preserve"> </w:t>
+            </w:r>
+            <w:hyperlink r:id="rId53">
+              <w:r>
+                <w:rPr>
+                  <w:rStyle w:val="Hyperlink"/>
+                  <w:color w:val="0066CC"/>
+                  <w:u w:val="single"/>
+                </w:rPr>
+                <w:t xml:space="preserve">Link</w:t>
               </w:r>
             </w:hyperlink>
             <w:r>
               <w:t xml:space="preserve"/>
               <w:br/>
-              <w:t xml:space="preserve">→ Presenters</w:t>
-            </w:r>
-            <w:r>
-              <w:t xml:space="preserve"> </w:t>
-            </w:r>
-            <w:hyperlink r:id="rId32">
-              <w:r>
-                <w:rPr>
-                  <w:rStyle w:val="Hyperlink"/>
-                  <w:color w:val="0066CC"/>
-                  <w:u w:val="single"/>
-                </w:rPr>
-                <w:t xml:space="preserve">Rubric</w:t>
-              </w:r>
-            </w:hyperlink>
-            <w:r>
-              <w:t xml:space="preserve">: Create a slide and prepare for a presentation (Due: Before class starts)</w:t>
-              <w:br/>
-              <w:t xml:space="preserve">→ Peer Assessment</w:t>
-            </w:r>
-            <w:r>
-              <w:t xml:space="preserve"> </w:t>
-            </w:r>
-            <w:hyperlink r:id="rId53">
+              <w:t xml:space="preserve">→ Instructor Feedback Slides</w:t>
+            </w:r>
+            <w:r>
+              <w:t xml:space="preserve"> </w:t>
+            </w:r>
+            <w:hyperlink r:id="rId62">
               <w:r>
                 <w:rPr>
                   <w:rStyle w:val="Hyperlink"/>
@@ -6015,7 +5962,7 @@
             <w:r>
               <w:t xml:space="preserve"> </w:t>
             </w:r>
-            <w:hyperlink r:id="rId107">
+            <w:hyperlink r:id="rId93">
               <w:r>
                 <w:rPr>
                   <w:rStyle w:val="Hyperlink"/>
@@ -6050,6 +5997,31 @@
             </w:r>
             <w:r>
               <w:t xml:space="preserve">(Due: 3/19 11:59 pm)</w:t>
+              <w:br/>
+              <w:br/>
+            </w:r>
+            <w:r>
+              <w:rPr>
+                <w:b/>
+                <w:bCs/>
+              </w:rPr>
+              <w:t xml:space="preserve">Activity: AI Training from Email Patterns</w:t>
+            </w:r>
+            <w:r>
+              <w:t xml:space="preserve"> </w:t>
+            </w:r>
+            <w:hyperlink r:id="rId94">
+              <w:r>
+                <w:rPr>
+                  <w:rStyle w:val="Hyperlink"/>
+                  <w:color w:val="0066CC"/>
+                  <w:u w:val="single"/>
+                </w:rPr>
+                <w:t xml:space="preserve">Instructions</w:t>
+              </w:r>
+            </w:hyperlink>
+            <w:r>
+              <w:t xml:space="preserve"/>
               <w:br/>
               <w:br/>
               <w:t xml:space="preserve">→ Participate in class and report your activity</w:t>
@@ -6108,7 +6080,7 @@
             <w:r>
               <w:t xml:space="preserve"> </w:t>
             </w:r>
-            <w:hyperlink r:id="rId108">
+            <w:hyperlink r:id="rId95">
               <w:r>
                 <w:rPr>
                   <w:rStyle w:val="Hyperlink"/>
@@ -6128,7 +6100,7 @@
             <w:r>
               <w:t xml:space="preserve"> </w:t>
             </w:r>
-            <w:hyperlink r:id="rId109">
+            <w:hyperlink r:id="rId96">
               <w:r>
                 <w:rPr>
                   <w:rStyle w:val="Hyperlink"/>
@@ -6165,7 +6137,7 @@
             <w:r>
               <w:t xml:space="preserve"> </w:t>
             </w:r>
-            <w:hyperlink r:id="rId110">
+            <w:hyperlink r:id="rId97">
               <w:r>
                 <w:rPr>
                   <w:rStyle w:val="Hyperlink"/>
@@ -6178,43 +6150,51 @@
             <w:r>
               <w:t xml:space="preserve"> </w:t>
             </w:r>
-            <w:hyperlink r:id="rId111">
-              <w:r>
-                <w:rPr>
-                  <w:rStyle w:val="Hyperlink"/>
-                  <w:color w:val="0066CC"/>
-                  <w:u w:val="single"/>
-                </w:rPr>
-                <w:t xml:space="preserve">Slide</w:t>
+            <w:r>
+              <w:t xml:space="preserve">[Slide]</w:t>
+              <w:br/>
+              <w:t xml:space="preserve">→ Presenters</w:t>
+            </w:r>
+            <w:r>
+              <w:t xml:space="preserve"> </w:t>
+            </w:r>
+            <w:hyperlink r:id="rId32">
+              <w:r>
+                <w:rPr>
+                  <w:rStyle w:val="Hyperlink"/>
+                  <w:color w:val="0066CC"/>
+                  <w:u w:val="single"/>
+                </w:rPr>
+                <w:t xml:space="preserve">Rubric</w:t>
+              </w:r>
+            </w:hyperlink>
+            <w:r>
+              <w:t xml:space="preserve">: Create a slide and prepare for a presentation (Due: Before class starts)</w:t>
+              <w:br/>
+              <w:t xml:space="preserve">→ Peer Assessment</w:t>
+            </w:r>
+            <w:r>
+              <w:t xml:space="preserve"> </w:t>
+            </w:r>
+            <w:hyperlink r:id="rId53">
+              <w:r>
+                <w:rPr>
+                  <w:rStyle w:val="Hyperlink"/>
+                  <w:color w:val="0066CC"/>
+                  <w:u w:val="single"/>
+                </w:rPr>
+                <w:t xml:space="preserve">Link</w:t>
               </w:r>
             </w:hyperlink>
             <w:r>
               <w:t xml:space="preserve"/>
               <w:br/>
-              <w:t xml:space="preserve">→ Presenters</w:t>
-            </w:r>
-            <w:r>
-              <w:t xml:space="preserve"> </w:t>
-            </w:r>
-            <w:hyperlink r:id="rId32">
-              <w:r>
-                <w:rPr>
-                  <w:rStyle w:val="Hyperlink"/>
-                  <w:color w:val="0066CC"/>
-                  <w:u w:val="single"/>
-                </w:rPr>
-                <w:t xml:space="preserve">Rubric</w:t>
-              </w:r>
-            </w:hyperlink>
-            <w:r>
-              <w:t xml:space="preserve">: Create a slide and prepare for a presentation (Due: Before class starts)</w:t>
-              <w:br/>
-              <w:t xml:space="preserve">→ Peer Assessment</w:t>
-            </w:r>
-            <w:r>
-              <w:t xml:space="preserve"> </w:t>
-            </w:r>
-            <w:hyperlink r:id="rId53">
+              <w:t xml:space="preserve">→ Instructor Feedback Slides</w:t>
+            </w:r>
+            <w:r>
+              <w:t xml:space="preserve"> </w:t>
+            </w:r>
+            <w:hyperlink r:id="rId62">
               <w:r>
                 <w:rPr>
                   <w:rStyle w:val="Hyperlink"/>
@@ -6284,7 +6264,7 @@
             <w:r>
               <w:t xml:space="preserve"> </w:t>
             </w:r>
-            <w:hyperlink r:id="rId112">
+            <w:hyperlink r:id="rId98">
               <w:r>
                 <w:rPr>
                   <w:rStyle w:val="Hyperlink"/>
@@ -6441,7 +6421,7 @@
             <w:r>
               <w:t xml:space="preserve"> </w:t>
             </w:r>
-            <w:hyperlink r:id="rId113">
+            <w:hyperlink r:id="rId99">
               <w:r>
                 <w:rPr>
                   <w:rStyle w:val="Hyperlink"/>
@@ -6461,7 +6441,7 @@
             <w:r>
               <w:t xml:space="preserve"> </w:t>
             </w:r>
-            <w:hyperlink r:id="rId114">
+            <w:hyperlink r:id="rId100">
               <w:r>
                 <w:rPr>
                   <w:rStyle w:val="Hyperlink"/>
@@ -6497,7 +6477,7 @@
               <w:t xml:space="preserve">- Continues on 4/9</w:t>
               <w:br/>
             </w:r>
-            <w:hyperlink r:id="rId115">
+            <w:hyperlink r:id="rId101">
               <w:r>
                 <w:rPr>
                   <w:rStyle w:val="Hyperlink"/>
@@ -6515,7 +6495,7 @@
             <w:r>
               <w:t xml:space="preserve"> </w:t>
             </w:r>
-            <w:hyperlink r:id="rId116">
+            <w:hyperlink r:id="rId102">
               <w:r>
                 <w:rPr>
                   <w:rStyle w:val="Hyperlink"/>
@@ -6620,7 +6600,7 @@
             <w:r>
               <w:t xml:space="preserve"> </w:t>
             </w:r>
-            <w:hyperlink r:id="rId117">
+            <w:hyperlink r:id="rId103">
               <w:r>
                 <w:rPr>
                   <w:rStyle w:val="Hyperlink"/>
@@ -6640,7 +6620,7 @@
             <w:r>
               <w:t xml:space="preserve"> </w:t>
             </w:r>
-            <w:hyperlink r:id="rId118">
+            <w:hyperlink r:id="rId104">
               <w:r>
                 <w:rPr>
                   <w:rStyle w:val="Hyperlink"/>
@@ -6672,7 +6652,7 @@
             <w:r>
               <w:t xml:space="preserve"> </w:t>
             </w:r>
-            <w:hyperlink r:id="rId119">
+            <w:hyperlink r:id="rId105">
               <w:r>
                 <w:rPr>
                   <w:rStyle w:val="Hyperlink"/>
@@ -6690,7 +6670,7 @@
             <w:r>
               <w:t xml:space="preserve"> </w:t>
             </w:r>
-            <w:hyperlink r:id="rId120">
+            <w:hyperlink r:id="rId106">
               <w:r>
                 <w:rPr>
                   <w:rStyle w:val="Hyperlink"/>
@@ -6708,7 +6688,7 @@
             <w:r>
               <w:t xml:space="preserve"> </w:t>
             </w:r>
-            <w:hyperlink r:id="rId121">
+            <w:hyperlink r:id="rId107">
               <w:r>
                 <w:rPr>
                   <w:rStyle w:val="Hyperlink"/>
@@ -6726,7 +6706,7 @@
             <w:r>
               <w:t xml:space="preserve"> </w:t>
             </w:r>
-            <w:hyperlink r:id="rId122">
+            <w:hyperlink r:id="rId108">
               <w:r>
                 <w:rPr>
                   <w:rStyle w:val="Hyperlink"/>
@@ -6744,7 +6724,7 @@
             <w:r>
               <w:t xml:space="preserve"> </w:t>
             </w:r>
-            <w:hyperlink r:id="rId123">
+            <w:hyperlink r:id="rId109">
               <w:r>
                 <w:rPr>
                   <w:rStyle w:val="Hyperlink"/>
@@ -6771,7 +6751,7 @@
             <w:r>
               <w:t xml:space="preserve"> </w:t>
             </w:r>
-            <w:hyperlink r:id="rId124">
+            <w:hyperlink r:id="rId110">
               <w:r>
                 <w:rPr>
                   <w:rStyle w:val="Hyperlink"/>
@@ -6864,7 +6844,7 @@
             <w:r>
               <w:t xml:space="preserve"> </w:t>
             </w:r>
-            <w:hyperlink r:id="rId119">
+            <w:hyperlink r:id="rId105">
               <w:r>
                 <w:rPr>
                   <w:rStyle w:val="Hyperlink"/>
@@ -6882,7 +6862,7 @@
             <w:r>
               <w:t xml:space="preserve"> </w:t>
             </w:r>
-            <w:hyperlink r:id="rId120">
+            <w:hyperlink r:id="rId106">
               <w:r>
                 <w:rPr>
                   <w:rStyle w:val="Hyperlink"/>
@@ -6900,7 +6880,7 @@
             <w:r>
               <w:t xml:space="preserve"> </w:t>
             </w:r>
-            <w:hyperlink r:id="rId121">
+            <w:hyperlink r:id="rId107">
               <w:r>
                 <w:rPr>
                   <w:rStyle w:val="Hyperlink"/>
@@ -6918,7 +6898,7 @@
             <w:r>
               <w:t xml:space="preserve"> </w:t>
             </w:r>
-            <w:hyperlink r:id="rId122">
+            <w:hyperlink r:id="rId108">
               <w:r>
                 <w:rPr>
                   <w:rStyle w:val="Hyperlink"/>
@@ -6936,7 +6916,7 @@
             <w:r>
               <w:t xml:space="preserve"> </w:t>
             </w:r>
-            <w:hyperlink r:id="rId123">
+            <w:hyperlink r:id="rId109">
               <w:r>
                 <w:rPr>
                   <w:rStyle w:val="Hyperlink"/>
@@ -7008,7 +6988,7 @@
             <w:r>
               <w:t xml:space="preserve"> </w:t>
             </w:r>
-            <w:hyperlink r:id="rId125">
+            <w:hyperlink r:id="rId111">
               <w:r>
                 <w:rPr>
                   <w:rStyle w:val="Hyperlink"/>
@@ -7026,7 +7006,7 @@
             <w:r>
               <w:t xml:space="preserve"> </w:t>
             </w:r>
-            <w:hyperlink r:id="rId126">
+            <w:hyperlink r:id="rId112">
               <w:r>
                 <w:rPr>
                   <w:rStyle w:val="Hyperlink"/>
@@ -7208,7 +7188,7 @@
             <w:r>
               <w:t xml:space="preserve"> </w:t>
             </w:r>
-            <w:hyperlink r:id="rId127">
+            <w:hyperlink r:id="rId113">
               <w:r>
                 <w:rPr>
                   <w:rStyle w:val="Hyperlink"/>
@@ -7228,7 +7208,7 @@
             <w:r>
               <w:t xml:space="preserve"> </w:t>
             </w:r>
-            <w:hyperlink r:id="rId128">
+            <w:hyperlink r:id="rId114">
               <w:r>
                 <w:rPr>
                   <w:rStyle w:val="Hyperlink"/>
@@ -7249,7 +7229,7 @@
             <w:r>
               <w:t xml:space="preserve"> </w:t>
             </w:r>
-            <w:hyperlink r:id="rId129">
+            <w:hyperlink r:id="rId115">
               <w:r>
                 <w:rPr>
                   <w:rStyle w:val="Hyperlink"/>
@@ -7286,7 +7266,7 @@
             <w:r>
               <w:t xml:space="preserve"> </w:t>
             </w:r>
-            <w:hyperlink r:id="rId130">
+            <w:hyperlink r:id="rId116">
               <w:r>
                 <w:rPr>
                   <w:rStyle w:val="Hyperlink"/>
@@ -7296,43 +7276,51 @@
                 <w:t xml:space="preserve">Link</w:t>
               </w:r>
             </w:hyperlink>
-            <w:hyperlink r:id="rId131">
-              <w:r>
-                <w:rPr>
-                  <w:rStyle w:val="Hyperlink"/>
-                  <w:color w:val="0066CC"/>
-                  <w:u w:val="single"/>
-                </w:rPr>
-                <w:t xml:space="preserve">Slide</w:t>
+            <w:r>
+              <w:t xml:space="preserve">[Slide]</w:t>
+              <w:br/>
+              <w:t xml:space="preserve">→ Presenters</w:t>
+            </w:r>
+            <w:r>
+              <w:t xml:space="preserve"> </w:t>
+            </w:r>
+            <w:hyperlink r:id="rId32">
+              <w:r>
+                <w:rPr>
+                  <w:rStyle w:val="Hyperlink"/>
+                  <w:color w:val="0066CC"/>
+                  <w:u w:val="single"/>
+                </w:rPr>
+                <w:t xml:space="preserve">Rubric</w:t>
+              </w:r>
+            </w:hyperlink>
+            <w:r>
+              <w:t xml:space="preserve">: Create a slide and prepare for a presentation (Due: Before class starts)</w:t>
+              <w:br/>
+              <w:t xml:space="preserve">→ Peer Assessment</w:t>
+            </w:r>
+            <w:r>
+              <w:t xml:space="preserve"> </w:t>
+            </w:r>
+            <w:hyperlink r:id="rId53">
+              <w:r>
+                <w:rPr>
+                  <w:rStyle w:val="Hyperlink"/>
+                  <w:color w:val="0066CC"/>
+                  <w:u w:val="single"/>
+                </w:rPr>
+                <w:t xml:space="preserve">Link</w:t>
               </w:r>
             </w:hyperlink>
             <w:r>
               <w:t xml:space="preserve"/>
               <w:br/>
-              <w:t xml:space="preserve">→ Presenters</w:t>
-            </w:r>
-            <w:r>
-              <w:t xml:space="preserve"> </w:t>
-            </w:r>
-            <w:hyperlink r:id="rId32">
-              <w:r>
-                <w:rPr>
-                  <w:rStyle w:val="Hyperlink"/>
-                  <w:color w:val="0066CC"/>
-                  <w:u w:val="single"/>
-                </w:rPr>
-                <w:t xml:space="preserve">Rubric</w:t>
-              </w:r>
-            </w:hyperlink>
-            <w:r>
-              <w:t xml:space="preserve">: Create a slide and prepare for a presentation (Due: Before class starts)</w:t>
-              <w:br/>
-              <w:t xml:space="preserve">→ Peer Assessment</w:t>
-            </w:r>
-            <w:r>
-              <w:t xml:space="preserve"> </w:t>
-            </w:r>
-            <w:hyperlink r:id="rId53">
+              <w:t xml:space="preserve">→ Instructor Feedback Slides</w:t>
+            </w:r>
+            <w:r>
+              <w:t xml:space="preserve"> </w:t>
+            </w:r>
+            <w:hyperlink r:id="rId62">
               <w:r>
                 <w:rPr>
                   <w:rStyle w:val="Hyperlink"/>
@@ -7402,7 +7390,7 @@
             <w:r>
               <w:t xml:space="preserve"> </w:t>
             </w:r>
-            <w:hyperlink r:id="rId132">
+            <w:hyperlink r:id="rId117">
               <w:r>
                 <w:rPr>
                   <w:rStyle w:val="Hyperlink"/>
@@ -7422,7 +7410,7 @@
             <w:r>
               <w:t xml:space="preserve"> </w:t>
             </w:r>
-            <w:hyperlink r:id="rId133">
+            <w:hyperlink r:id="rId118">
               <w:r>
                 <w:rPr>
                   <w:rStyle w:val="Hyperlink"/>
@@ -7460,7 +7448,7 @@
             <w:r>
               <w:t xml:space="preserve"> </w:t>
             </w:r>
-            <w:hyperlink r:id="rId134">
+            <w:hyperlink r:id="rId119">
               <w:r>
                 <w:rPr>
                   <w:rStyle w:val="Hyperlink"/>
@@ -7553,7 +7541,7 @@
             <w:r>
               <w:t xml:space="preserve"> </w:t>
             </w:r>
-            <w:hyperlink r:id="rId135">
+            <w:hyperlink r:id="rId120">
               <w:r>
                 <w:rPr>
                   <w:rStyle w:val="Hyperlink"/>
@@ -7573,7 +7561,7 @@
             <w:r>
               <w:t xml:space="preserve"> </w:t>
             </w:r>
-            <w:hyperlink r:id="rId136">
+            <w:hyperlink r:id="rId121">
               <w:r>
                 <w:rPr>
                   <w:rStyle w:val="Hyperlink"/>
@@ -7705,8 +7693,8 @@
         </w:pict>
       </w:r>
     </w:p>
-    <w:bookmarkEnd w:id="137"/>
-    <w:bookmarkStart w:id="138" w:name="statute-of-limitations"/>
+    <w:bookmarkEnd w:id="122"/>
+    <w:bookmarkStart w:id="123" w:name="statute-of-limitations"/>
     <w:p>
       <w:pPr>
         <w:pStyle w:val="Heading2"/>
@@ -7730,8 +7718,8 @@
         </w:pict>
       </w:r>
     </w:p>
-    <w:bookmarkEnd w:id="138"/>
-    <w:bookmarkStart w:id="139" w:name="Xcdf663987d64b083671ee3932ebb0b331517c8d"/>
+    <w:bookmarkEnd w:id="123"/>
+    <w:bookmarkStart w:id="124" w:name="Xcdf663987d64b083671ee3932ebb0b331517c8d"/>
     <w:p>
       <w:pPr>
         <w:pStyle w:val="Heading2"/>
@@ -7844,8 +7832,8 @@
         <w:t xml:space="preserve">Please email at spak2@csub.edu if you are interested in knowing more about the student chapter.</w:t>
       </w:r>
     </w:p>
-    <w:bookmarkEnd w:id="139"/>
-    <w:bookmarkStart w:id="140" w:name="Xb583615bf7900c58ca4ec1c55b87d89181c5454"/>
+    <w:bookmarkEnd w:id="124"/>
+    <w:bookmarkStart w:id="125" w:name="Xb583615bf7900c58ca4ec1c55b87d89181c5454"/>
     <w:p>
       <w:pPr>
         <w:pStyle w:val="Heading2"/>
@@ -7889,8 +7877,8 @@
         </w:pict>
       </w:r>
     </w:p>
-    <w:bookmarkEnd w:id="140"/>
-    <w:bookmarkStart w:id="141" w:name="inclusiveness-and-safety-at-csub"/>
+    <w:bookmarkEnd w:id="125"/>
+    <w:bookmarkStart w:id="126" w:name="inclusiveness-and-safety-at-csub"/>
     <w:p>
       <w:pPr>
         <w:pStyle w:val="Heading2"/>
@@ -7942,8 +7930,8 @@
         </w:pict>
       </w:r>
     </w:p>
-    <w:bookmarkEnd w:id="141"/>
-    <w:bookmarkStart w:id="142" w:name="X3ca00938d41e62e7e6f8de7a6b6718fae956584"/>
+    <w:bookmarkEnd w:id="126"/>
+    <w:bookmarkStart w:id="127" w:name="X3ca00938d41e62e7e6f8de7a6b6718fae956584"/>
     <w:p>
       <w:pPr>
         <w:pStyle w:val="Heading2"/>
@@ -8103,8 +8091,8 @@
         </w:pict>
       </w:r>
     </w:p>
-    <w:bookmarkEnd w:id="142"/>
-    <w:bookmarkStart w:id="143" w:name="academic-integrity"/>
+    <w:bookmarkEnd w:id="127"/>
+    <w:bookmarkStart w:id="128" w:name="academic-integrity"/>
     <w:p>
       <w:pPr>
         <w:pStyle w:val="Heading2"/>
@@ -8144,8 +8132,8 @@
         </w:pict>
       </w:r>
     </w:p>
-    <w:bookmarkEnd w:id="143"/>
-    <w:bookmarkStart w:id="144" w:name="using-ai-tools-chatgpt"/>
+    <w:bookmarkEnd w:id="128"/>
+    <w:bookmarkStart w:id="129" w:name="using-ai-tools-chatgpt"/>
     <w:p>
       <w:pPr>
         <w:pStyle w:val="Heading2"/>
@@ -8254,8 +8242,8 @@
         </w:pict>
       </w:r>
     </w:p>
-    <w:bookmarkEnd w:id="144"/>
-    <w:bookmarkStart w:id="145" w:name="catalog-statement"/>
+    <w:bookmarkEnd w:id="129"/>
+    <w:bookmarkStart w:id="130" w:name="catalog-statement"/>
     <w:p>
       <w:pPr>
         <w:pStyle w:val="Heading2"/>
@@ -8279,8 +8267,8 @@
         </w:pict>
       </w:r>
     </w:p>
-    <w:bookmarkEnd w:id="145"/>
-    <w:bookmarkStart w:id="146" w:name="cece-workshops-events"/>
+    <w:bookmarkEnd w:id="130"/>
+    <w:bookmarkStart w:id="131" w:name="cece-workshops-events"/>
     <w:p>
       <w:pPr>
         <w:pStyle w:val="Heading2"/>
@@ -8312,8 +8300,8 @@
         </w:pict>
       </w:r>
     </w:p>
-    <w:bookmarkEnd w:id="146"/>
-    <w:bookmarkStart w:id="166" w:name="related-files"/>
+    <w:bookmarkEnd w:id="131"/>
+    <w:bookmarkStart w:id="138" w:name="related-files"/>
     <w:p>
       <w:pPr>
         <w:pStyle w:val="Heading2"/>
@@ -8322,7 +8310,7 @@
         <w:t xml:space="preserve">Related Files</w:t>
       </w:r>
     </w:p>
-    <w:bookmarkStart w:id="149" w:name="rubrics-guidelines"/>
+    <w:bookmarkStart w:id="132" w:name="rubrics-guidelines"/>
     <w:p>
       <w:pPr>
         <w:pStyle w:val="Heading3"/>
@@ -8338,7 +8326,7 @@
           <w:numId w:val="1010"/>
         </w:numPr>
       </w:pPr>
-      <w:hyperlink r:id="rId147">
+      <w:hyperlink r:id="rId32">
         <w:r>
           <w:rPr>
             <w:rStyle w:val="Hyperlink"/>
@@ -8362,7 +8350,7 @@
           <w:numId w:val="1010"/>
         </w:numPr>
       </w:pPr>
-      <w:hyperlink r:id="rId148">
+      <w:hyperlink r:id="rId35">
         <w:r>
           <w:rPr>
             <w:rStyle w:val="Hyperlink"/>
@@ -8379,8 +8367,8 @@
         <w:t xml:space="preserve">- Instructions and grading criteria for team meetings</w:t>
       </w:r>
     </w:p>
-    <w:bookmarkEnd w:id="149"/>
-    <w:bookmarkStart w:id="161" w:name="team-meeting-agendas"/>
+    <w:bookmarkEnd w:id="132"/>
+    <w:bookmarkStart w:id="133" w:name="team-meeting-agendas"/>
     <w:p>
       <w:pPr>
         <w:pStyle w:val="Heading3"/>
@@ -8396,7 +8384,7 @@
           <w:numId w:val="1011"/>
         </w:numPr>
       </w:pPr>
-      <w:hyperlink r:id="rId150">
+      <w:hyperlink r:id="rId52">
         <w:r>
           <w:rPr>
             <w:rStyle w:val="Hyperlink"/>
@@ -8420,7 +8408,7 @@
           <w:numId w:val="1011"/>
         </w:numPr>
       </w:pPr>
-      <w:hyperlink r:id="rId151">
+      <w:hyperlink r:id="rId58">
         <w:r>
           <w:rPr>
             <w:rStyle w:val="Hyperlink"/>
@@ -8444,7 +8432,7 @@
           <w:numId w:val="1011"/>
         </w:numPr>
       </w:pPr>
-      <w:hyperlink r:id="rId152">
+      <w:hyperlink r:id="rId63">
         <w:r>
           <w:rPr>
             <w:rStyle w:val="Hyperlink"/>
@@ -8468,7 +8456,7 @@
           <w:numId w:val="1011"/>
         </w:numPr>
       </w:pPr>
-      <w:hyperlink r:id="rId153">
+      <w:hyperlink r:id="rId67">
         <w:r>
           <w:rPr>
             <w:rStyle w:val="Hyperlink"/>
@@ -8492,7 +8480,7 @@
           <w:numId w:val="1011"/>
         </w:numPr>
       </w:pPr>
-      <w:hyperlink r:id="rId154">
+      <w:hyperlink r:id="rId74">
         <w:r>
           <w:rPr>
             <w:rStyle w:val="Hyperlink"/>
@@ -8516,7 +8504,7 @@
           <w:numId w:val="1011"/>
         </w:numPr>
       </w:pPr>
-      <w:hyperlink r:id="rId155">
+      <w:hyperlink r:id="rId82">
         <w:r>
           <w:rPr>
             <w:rStyle w:val="Hyperlink"/>
@@ -8540,7 +8528,7 @@
           <w:numId w:val="1011"/>
         </w:numPr>
       </w:pPr>
-      <w:hyperlink r:id="rId156">
+      <w:hyperlink r:id="rId88">
         <w:r>
           <w:rPr>
             <w:rStyle w:val="Hyperlink"/>
@@ -8564,7 +8552,7 @@
           <w:numId w:val="1011"/>
         </w:numPr>
       </w:pPr>
-      <w:hyperlink r:id="rId157">
+      <w:hyperlink r:id="rId93">
         <w:r>
           <w:rPr>
             <w:rStyle w:val="Hyperlink"/>
@@ -8588,7 +8576,7 @@
           <w:numId w:val="1011"/>
         </w:numPr>
       </w:pPr>
-      <w:hyperlink r:id="rId158">
+      <w:hyperlink r:id="rId98">
         <w:r>
           <w:rPr>
             <w:rStyle w:val="Hyperlink"/>
@@ -8612,7 +8600,7 @@
           <w:numId w:val="1011"/>
         </w:numPr>
       </w:pPr>
-      <w:hyperlink r:id="rId159">
+      <w:hyperlink r:id="rId110">
         <w:r>
           <w:rPr>
             <w:rStyle w:val="Hyperlink"/>
@@ -8636,7 +8624,7 @@
           <w:numId w:val="1011"/>
         </w:numPr>
       </w:pPr>
-      <w:hyperlink r:id="rId160">
+      <w:hyperlink r:id="rId119">
         <w:r>
           <w:rPr>
             <w:rStyle w:val="Hyperlink"/>
@@ -8653,8 +8641,8 @@
         <w:t xml:space="preserve">- Week 15 (Last)</w:t>
       </w:r>
     </w:p>
-    <w:bookmarkEnd w:id="161"/>
-    <w:bookmarkStart w:id="163" w:name="schedules-rosters"/>
+    <w:bookmarkEnd w:id="133"/>
+    <w:bookmarkStart w:id="135" w:name="schedules-rosters"/>
     <w:p>
       <w:pPr>
         <w:pStyle w:val="Heading3"/>
@@ -8671,7 +8659,7 @@
           <w:numId w:val="1012"/>
         </w:numPr>
       </w:pPr>
-      <w:hyperlink r:id="rId162">
+      <w:hyperlink r:id="rId134">
         <w:r>
           <w:rPr>
             <w:rStyle w:val="Hyperlink"/>
@@ -8688,8 +8676,8 @@
         <w:t xml:space="preserve">- Class roster and team assignments</w:t>
       </w:r>
     </w:p>
-    <w:bookmarkEnd w:id="163"/>
-    <w:bookmarkStart w:id="165" w:name="external-links"/>
+    <w:bookmarkEnd w:id="135"/>
+    <w:bookmarkStart w:id="137" w:name="external-links"/>
     <w:p>
       <w:pPr>
         <w:pStyle w:val="Heading3"/>
@@ -8777,7 +8765,7 @@
           <w:numId w:val="1013"/>
         </w:numPr>
       </w:pPr>
-      <w:hyperlink r:id="rId164">
+      <w:hyperlink r:id="rId136">
         <w:r>
           <w:rPr>
             <w:rStyle w:val="Hyperlink"/>
@@ -8794,8 +8782,8 @@
         <w:t xml:space="preserve">- Editable syllabus document</w:t>
       </w:r>
     </w:p>
-    <w:bookmarkEnd w:id="165"/>
-    <w:bookmarkEnd w:id="166"/>
+    <w:bookmarkEnd w:id="137"/>
+    <w:bookmarkEnd w:id="138"/>
     <w:sectPr>
       <w:footnotePr>
         <w:numRestart w:val="eachSect"/>

</xml_diff>

<commit_message>
Remove duplicate Instructor Feedback Slides link from non-3/17 dates
Link was incorrectly duplicated across all team presentation dates.
Now only appears on 3/17 (Team 2, Ch 8) where it belongs.

Co-Authored-By: Claude Opus 4.6 (1M context) <noreply@anthropic.com>
</commit_message>
<xml_diff>
--- a/Syllabus.docx
+++ b/Syllabus.docx
@@ -4024,24 +4024,6 @@
             <w:r>
               <w:t xml:space="preserve"/>
               <w:br/>
-              <w:t xml:space="preserve">→ Instructor Feedback Slides</w:t>
-            </w:r>
-            <w:r>
-              <w:t xml:space="preserve"> </w:t>
-            </w:r>
-            <w:hyperlink r:id="rId62">
-              <w:r>
-                <w:rPr>
-                  <w:rStyle w:val="Hyperlink"/>
-                  <w:color w:val="0066CC"/>
-                  <w:u w:val="single"/>
-                </w:rPr>
-                <w:t xml:space="preserve">Link</w:t>
-              </w:r>
-            </w:hyperlink>
-            <w:r>
-              <w:t xml:space="preserve"/>
-              <w:br/>
               <w:br/>
               <w:t xml:space="preserve">→ Participate in class and report your activity</w:t>
             </w:r>
@@ -4099,7 +4081,7 @@
             <w:r>
               <w:t xml:space="preserve"> </w:t>
             </w:r>
-            <w:hyperlink r:id="rId63">
+            <w:hyperlink r:id="rId62">
               <w:r>
                 <w:rPr>
                   <w:rStyle w:val="Hyperlink"/>
@@ -4233,27 +4215,27 @@
             <w:r>
               <w:t xml:space="preserve"> </w:t>
             </w:r>
+            <w:hyperlink r:id="rId63">
+              <w:r>
+                <w:rPr>
+                  <w:rStyle w:val="Hyperlink"/>
+                  <w:color w:val="0066CC"/>
+                  <w:u w:val="single"/>
+                </w:rPr>
+                <w:t xml:space="preserve">Lecture slide</w:t>
+              </w:r>
+            </w:hyperlink>
+            <w:r>
+              <w:t xml:space="preserve"/>
+              <w:br/>
+              <w:t xml:space="preserve">→ Read the textbook: Ch 3 (Due: 2/2 11:59 pm)</w:t>
+              <w:br/>
+              <w:t xml:space="preserve">→ Ch 3 Watch It Video: Women vs Men, In the Workplace</w:t>
+            </w:r>
+            <w:r>
+              <w:t xml:space="preserve"> </w:t>
+            </w:r>
             <w:hyperlink r:id="rId64">
-              <w:r>
-                <w:rPr>
-                  <w:rStyle w:val="Hyperlink"/>
-                  <w:color w:val="0066CC"/>
-                  <w:u w:val="single"/>
-                </w:rPr>
-                <w:t xml:space="preserve">Lecture slide</w:t>
-              </w:r>
-            </w:hyperlink>
-            <w:r>
-              <w:t xml:space="preserve"/>
-              <w:br/>
-              <w:t xml:space="preserve">→ Read the textbook: Ch 3 (Due: 2/2 11:59 pm)</w:t>
-              <w:br/>
-              <w:t xml:space="preserve">→ Ch 3 Watch It Video: Women vs Men, In the Workplace</w:t>
-            </w:r>
-            <w:r>
-              <w:t xml:space="preserve"> </w:t>
-            </w:r>
-            <w:hyperlink r:id="rId65">
               <w:r>
                 <w:rPr>
                   <w:rStyle w:val="Hyperlink"/>
@@ -4290,7 +4272,7 @@
             <w:r>
               <w:t xml:space="preserve"> </w:t>
             </w:r>
-            <w:hyperlink r:id="rId66">
+            <w:hyperlink r:id="rId65">
               <w:r>
                 <w:rPr>
                   <w:rStyle w:val="Hyperlink"/>
@@ -4330,24 +4312,6 @@
               <w:t xml:space="preserve"> </w:t>
             </w:r>
             <w:hyperlink r:id="rId53">
-              <w:r>
-                <w:rPr>
-                  <w:rStyle w:val="Hyperlink"/>
-                  <w:color w:val="0066CC"/>
-                  <w:u w:val="single"/>
-                </w:rPr>
-                <w:t xml:space="preserve">Link</w:t>
-              </w:r>
-            </w:hyperlink>
-            <w:r>
-              <w:t xml:space="preserve"/>
-              <w:br/>
-              <w:t xml:space="preserve">→ Instructor Feedback Slides</w:t>
-            </w:r>
-            <w:r>
-              <w:t xml:space="preserve"> </w:t>
-            </w:r>
-            <w:hyperlink r:id="rId62">
               <w:r>
                 <w:rPr>
                   <w:rStyle w:val="Hyperlink"/>
@@ -4417,7 +4381,7 @@
             <w:r>
               <w:t xml:space="preserve"> </w:t>
             </w:r>
-            <w:hyperlink r:id="rId67">
+            <w:hyperlink r:id="rId66">
               <w:r>
                 <w:rPr>
                   <w:rStyle w:val="Hyperlink"/>
@@ -4510,27 +4474,27 @@
             <w:r>
               <w:t xml:space="preserve"> </w:t>
             </w:r>
+            <w:hyperlink r:id="rId67">
+              <w:r>
+                <w:rPr>
+                  <w:rStyle w:val="Hyperlink"/>
+                  <w:color w:val="0066CC"/>
+                  <w:u w:val="single"/>
+                </w:rPr>
+                <w:t xml:space="preserve">Lecture slide</w:t>
+              </w:r>
+            </w:hyperlink>
+            <w:r>
+              <w:t xml:space="preserve"/>
+              <w:br/>
+              <w:t xml:space="preserve">→ Read the textbook: Ch 4 (Due: 2/9 11:59 pm)</w:t>
+              <w:br/>
+              <w:t xml:space="preserve">→ Ch 4 Watch It Video</w:t>
+            </w:r>
+            <w:r>
+              <w:t xml:space="preserve"> </w:t>
+            </w:r>
             <w:hyperlink r:id="rId68">
-              <w:r>
-                <w:rPr>
-                  <w:rStyle w:val="Hyperlink"/>
-                  <w:color w:val="0066CC"/>
-                  <w:u w:val="single"/>
-                </w:rPr>
-                <w:t xml:space="preserve">Lecture slide</w:t>
-              </w:r>
-            </w:hyperlink>
-            <w:r>
-              <w:t xml:space="preserve"/>
-              <w:br/>
-              <w:t xml:space="preserve">→ Read the textbook: Ch 4 (Due: 2/9 11:59 pm)</w:t>
-              <w:br/>
-              <w:t xml:space="preserve">→ Ch 4 Watch It Video</w:t>
-            </w:r>
-            <w:r>
-              <w:t xml:space="preserve"> </w:t>
-            </w:r>
-            <w:hyperlink r:id="rId69">
               <w:r>
                 <w:rPr>
                   <w:rStyle w:val="Hyperlink"/>
@@ -4567,7 +4531,7 @@
             <w:r>
               <w:t xml:space="preserve"> </w:t>
             </w:r>
-            <w:hyperlink r:id="rId70">
+            <w:hyperlink r:id="rId69">
               <w:r>
                 <w:rPr>
                   <w:rStyle w:val="Hyperlink"/>
@@ -4607,24 +4571,6 @@
               <w:t xml:space="preserve"> </w:t>
             </w:r>
             <w:hyperlink r:id="rId53">
-              <w:r>
-                <w:rPr>
-                  <w:rStyle w:val="Hyperlink"/>
-                  <w:color w:val="0066CC"/>
-                  <w:u w:val="single"/>
-                </w:rPr>
-                <w:t xml:space="preserve">Link</w:t>
-              </w:r>
-            </w:hyperlink>
-            <w:r>
-              <w:t xml:space="preserve"/>
-              <w:br/>
-              <w:t xml:space="preserve">→ Instructor Feedback Slides</w:t>
-            </w:r>
-            <w:r>
-              <w:t xml:space="preserve"> </w:t>
-            </w:r>
-            <w:hyperlink r:id="rId62">
               <w:r>
                 <w:rPr>
                   <w:rStyle w:val="Hyperlink"/>
@@ -4675,6 +4621,24 @@
             <w:r>
               <w:t xml:space="preserve"> </w:t>
             </w:r>
+            <w:hyperlink r:id="rId70">
+              <w:r>
+                <w:rPr>
+                  <w:rStyle w:val="Hyperlink"/>
+                  <w:color w:val="0066CC"/>
+                  <w:u w:val="single"/>
+                </w:rPr>
+                <w:t xml:space="preserve">Link</w:t>
+              </w:r>
+            </w:hyperlink>
+            <w:r>
+              <w:t xml:space="preserve"/>
+              <w:br/>
+              <w:t xml:space="preserve">Example Report from Previous Students</w:t>
+            </w:r>
+            <w:r>
+              <w:t xml:space="preserve"> </w:t>
+            </w:r>
             <w:hyperlink r:id="rId71">
               <w:r>
                 <w:rPr>
@@ -4682,34 +4646,16 @@
                   <w:color w:val="0066CC"/>
                   <w:u w:val="single"/>
                 </w:rPr>
-                <w:t xml:space="preserve">Link</w:t>
-              </w:r>
-            </w:hyperlink>
-            <w:r>
-              <w:t xml:space="preserve"/>
-              <w:br/>
-              <w:t xml:space="preserve">Example Report from Previous Students</w:t>
+                <w:t xml:space="preserve">Handwritten note</w:t>
+              </w:r>
+            </w:hyperlink>
+            <w:r>
+              <w:t xml:space="preserve">,</w:t>
             </w:r>
             <w:r>
               <w:t xml:space="preserve"> </w:t>
             </w:r>
             <w:hyperlink r:id="rId72">
-              <w:r>
-                <w:rPr>
-                  <w:rStyle w:val="Hyperlink"/>
-                  <w:color w:val="0066CC"/>
-                  <w:u w:val="single"/>
-                </w:rPr>
-                <w:t xml:space="preserve">Handwritten note</w:t>
-              </w:r>
-            </w:hyperlink>
-            <w:r>
-              <w:t xml:space="preserve">,</w:t>
-            </w:r>
-            <w:r>
-              <w:t xml:space="preserve"> </w:t>
-            </w:r>
-            <w:hyperlink r:id="rId73">
               <w:r>
                 <w:rPr>
                   <w:rStyle w:val="Hyperlink"/>
@@ -4779,7 +4725,7 @@
             <w:r>
               <w:t xml:space="preserve"> </w:t>
             </w:r>
-            <w:hyperlink r:id="rId74">
+            <w:hyperlink r:id="rId73">
               <w:r>
                 <w:rPr>
                   <w:rStyle w:val="Hyperlink"/>
@@ -4872,27 +4818,27 @@
             <w:r>
               <w:t xml:space="preserve"> </w:t>
             </w:r>
+            <w:hyperlink r:id="rId74">
+              <w:r>
+                <w:rPr>
+                  <w:rStyle w:val="Hyperlink"/>
+                  <w:color w:val="0066CC"/>
+                  <w:u w:val="single"/>
+                </w:rPr>
+                <w:t xml:space="preserve">Lecture slide</w:t>
+              </w:r>
+            </w:hyperlink>
+            <w:r>
+              <w:t xml:space="preserve"/>
+              <w:br/>
+              <w:t xml:space="preserve">→ Read the textbook: Ch 5 (Due: 2/16 11:59 pm)</w:t>
+              <w:br/>
+              <w:t xml:space="preserve">→ Ch 5 Watch It Video</w:t>
+            </w:r>
+            <w:r>
+              <w:t xml:space="preserve"> </w:t>
+            </w:r>
             <w:hyperlink r:id="rId75">
-              <w:r>
-                <w:rPr>
-                  <w:rStyle w:val="Hyperlink"/>
-                  <w:color w:val="0066CC"/>
-                  <w:u w:val="single"/>
-                </w:rPr>
-                <w:t xml:space="preserve">Lecture slide</w:t>
-              </w:r>
-            </w:hyperlink>
-            <w:r>
-              <w:t xml:space="preserve"/>
-              <w:br/>
-              <w:t xml:space="preserve">→ Read the textbook: Ch 5 (Due: 2/16 11:59 pm)</w:t>
-              <w:br/>
-              <w:t xml:space="preserve">→ Ch 5 Watch It Video</w:t>
-            </w:r>
-            <w:r>
-              <w:t xml:space="preserve"> </w:t>
-            </w:r>
-            <w:hyperlink r:id="rId76">
               <w:r>
                 <w:rPr>
                   <w:rStyle w:val="Hyperlink"/>
@@ -4928,23 +4874,23 @@
               <w:t xml:space="preserve">- Continues on 2/19</w:t>
               <w:br/>
             </w:r>
+            <w:hyperlink r:id="rId76">
+              <w:r>
+                <w:rPr>
+                  <w:rStyle w:val="Hyperlink"/>
+                  <w:color w:val="0066CC"/>
+                  <w:u w:val="single"/>
+                </w:rPr>
+                <w:t xml:space="preserve">Instructions</w:t>
+              </w:r>
+            </w:hyperlink>
+            <w:r>
+              <w:t xml:space="preserve">,</w:t>
+            </w:r>
+            <w:r>
+              <w:t xml:space="preserve"> </w:t>
+            </w:r>
             <w:hyperlink r:id="rId77">
-              <w:r>
-                <w:rPr>
-                  <w:rStyle w:val="Hyperlink"/>
-                  <w:color w:val="0066CC"/>
-                  <w:u w:val="single"/>
-                </w:rPr>
-                <w:t xml:space="preserve">Instructions</w:t>
-              </w:r>
-            </w:hyperlink>
-            <w:r>
-              <w:t xml:space="preserve">,</w:t>
-            </w:r>
-            <w:r>
-              <w:t xml:space="preserve"> </w:t>
-            </w:r>
-            <w:hyperlink r:id="rId78">
               <w:r>
                 <w:rPr>
                   <w:rStyle w:val="Hyperlink"/>
@@ -5077,27 +5023,27 @@
             <w:r>
               <w:t xml:space="preserve"> </w:t>
             </w:r>
+            <w:hyperlink r:id="rId78">
+              <w:r>
+                <w:rPr>
+                  <w:rStyle w:val="Hyperlink"/>
+                  <w:color w:val="0066CC"/>
+                  <w:u w:val="single"/>
+                </w:rPr>
+                <w:t xml:space="preserve">Lecture slide</w:t>
+              </w:r>
+            </w:hyperlink>
+            <w:r>
+              <w:t xml:space="preserve"/>
+              <w:br/>
+              <w:t xml:space="preserve">→ Read the textbook: Ch 6 (Due: 2/23 11:59 pm)</w:t>
+              <w:br/>
+              <w:t xml:space="preserve">→ Ch 6 Watch It Video: Social Media Clean Up - Tips for Students and Job Seekers</w:t>
+            </w:r>
+            <w:r>
+              <w:t xml:space="preserve"> </w:t>
+            </w:r>
             <w:hyperlink r:id="rId79">
-              <w:r>
-                <w:rPr>
-                  <w:rStyle w:val="Hyperlink"/>
-                  <w:color w:val="0066CC"/>
-                  <w:u w:val="single"/>
-                </w:rPr>
-                <w:t xml:space="preserve">Lecture slide</w:t>
-              </w:r>
-            </w:hyperlink>
-            <w:r>
-              <w:t xml:space="preserve"/>
-              <w:br/>
-              <w:t xml:space="preserve">→ Read the textbook: Ch 6 (Due: 2/23 11:59 pm)</w:t>
-              <w:br/>
-              <w:t xml:space="preserve">→ Ch 6 Watch It Video: Social Media Clean Up - Tips for Students and Job Seekers</w:t>
-            </w:r>
-            <w:r>
-              <w:t xml:space="preserve"> </w:t>
-            </w:r>
-            <w:hyperlink r:id="rId80">
               <w:r>
                 <w:rPr>
                   <w:rStyle w:val="Hyperlink"/>
@@ -5134,7 +5080,7 @@
             <w:r>
               <w:t xml:space="preserve"> </w:t>
             </w:r>
-            <w:hyperlink r:id="rId81">
+            <w:hyperlink r:id="rId80">
               <w:r>
                 <w:rPr>
                   <w:rStyle w:val="Hyperlink"/>
@@ -5174,24 +5120,6 @@
               <w:t xml:space="preserve"> </w:t>
             </w:r>
             <w:hyperlink r:id="rId53">
-              <w:r>
-                <w:rPr>
-                  <w:rStyle w:val="Hyperlink"/>
-                  <w:color w:val="0066CC"/>
-                  <w:u w:val="single"/>
-                </w:rPr>
-                <w:t xml:space="preserve">Link</w:t>
-              </w:r>
-            </w:hyperlink>
-            <w:r>
-              <w:t xml:space="preserve"/>
-              <w:br/>
-              <w:t xml:space="preserve">→ Instructor Feedback Slides</w:t>
-            </w:r>
-            <w:r>
-              <w:t xml:space="preserve"> </w:t>
-            </w:r>
-            <w:hyperlink r:id="rId62">
               <w:r>
                 <w:rPr>
                   <w:rStyle w:val="Hyperlink"/>
@@ -5261,7 +5189,7 @@
             <w:r>
               <w:t xml:space="preserve"> </w:t>
             </w:r>
-            <w:hyperlink r:id="rId82">
+            <w:hyperlink r:id="rId81">
               <w:r>
                 <w:rPr>
                   <w:rStyle w:val="Hyperlink"/>
@@ -5396,7 +5324,7 @@
               <w:t xml:space="preserve"/>
               <w:br/>
             </w:r>
-            <w:hyperlink r:id="rId83">
+            <w:hyperlink r:id="rId82">
               <w:r>
                 <w:rPr>
                   <w:rStyle w:val="Hyperlink"/>
@@ -5465,27 +5393,27 @@
             <w:r>
               <w:t xml:space="preserve"> </w:t>
             </w:r>
+            <w:hyperlink r:id="rId83">
+              <w:r>
+                <w:rPr>
+                  <w:rStyle w:val="Hyperlink"/>
+                  <w:color w:val="0066CC"/>
+                  <w:u w:val="single"/>
+                </w:rPr>
+                <w:t xml:space="preserve">Lecture slide</w:t>
+              </w:r>
+            </w:hyperlink>
+            <w:r>
+              <w:t xml:space="preserve"/>
+              <w:br/>
+              <w:t xml:space="preserve">→ Read the textbook: Ch 7 (Due: 3/9 11:59 pm)</w:t>
+              <w:br/>
+              <w:t xml:space="preserve">→ Ch 7 Watch It Video</w:t>
+            </w:r>
+            <w:r>
+              <w:t xml:space="preserve"> </w:t>
+            </w:r>
             <w:hyperlink r:id="rId84">
-              <w:r>
-                <w:rPr>
-                  <w:rStyle w:val="Hyperlink"/>
-                  <w:color w:val="0066CC"/>
-                  <w:u w:val="single"/>
-                </w:rPr>
-                <w:t xml:space="preserve">Lecture slide</w:t>
-              </w:r>
-            </w:hyperlink>
-            <w:r>
-              <w:t xml:space="preserve"/>
-              <w:br/>
-              <w:t xml:space="preserve">→ Read the textbook: Ch 7 (Due: 3/9 11:59 pm)</w:t>
-              <w:br/>
-              <w:t xml:space="preserve">→ Ch 7 Watch It Video</w:t>
-            </w:r>
-            <w:r>
-              <w:t xml:space="preserve"> </w:t>
-            </w:r>
-            <w:hyperlink r:id="rId85">
               <w:r>
                 <w:rPr>
                   <w:rStyle w:val="Hyperlink"/>
@@ -5522,7 +5450,7 @@
             <w:r>
               <w:t xml:space="preserve"> </w:t>
             </w:r>
-            <w:hyperlink r:id="rId86">
+            <w:hyperlink r:id="rId85">
               <w:r>
                 <w:rPr>
                   <w:rStyle w:val="Hyperlink"/>
@@ -5562,24 +5490,6 @@
               <w:t xml:space="preserve"> </w:t>
             </w:r>
             <w:hyperlink r:id="rId53">
-              <w:r>
-                <w:rPr>
-                  <w:rStyle w:val="Hyperlink"/>
-                  <w:color w:val="0066CC"/>
-                  <w:u w:val="single"/>
-                </w:rPr>
-                <w:t xml:space="preserve">Link</w:t>
-              </w:r>
-            </w:hyperlink>
-            <w:r>
-              <w:t xml:space="preserve"/>
-              <w:br/>
-              <w:t xml:space="preserve">→ Instructor Feedback Slides</w:t>
-            </w:r>
-            <w:r>
-              <w:t xml:space="preserve"> </w:t>
-            </w:r>
-            <w:hyperlink r:id="rId62">
               <w:r>
                 <w:rPr>
                   <w:rStyle w:val="Hyperlink"/>
@@ -5649,7 +5559,7 @@
             <w:r>
               <w:t xml:space="preserve"> </w:t>
             </w:r>
-            <w:hyperlink r:id="rId87">
+            <w:hyperlink r:id="rId86">
               <w:r>
                 <w:rPr>
                   <w:rStyle w:val="Hyperlink"/>
@@ -5674,7 +5584,7 @@
             <w:r>
               <w:t xml:space="preserve"> </w:t>
             </w:r>
-            <w:hyperlink r:id="rId88">
+            <w:hyperlink r:id="rId87">
               <w:r>
                 <w:rPr>
                   <w:rStyle w:val="Hyperlink"/>
@@ -5748,7 +5658,7 @@
               <w:t xml:space="preserve">3/17 Tue</w:t>
               <w:br/>
             </w:r>
-            <w:hyperlink r:id="rId89">
+            <w:hyperlink r:id="rId88">
               <w:r>
                 <w:rPr>
                   <w:rStyle w:val="Hyperlink"/>
@@ -5778,27 +5688,27 @@
             <w:r>
               <w:t xml:space="preserve"> </w:t>
             </w:r>
+            <w:hyperlink r:id="rId89">
+              <w:r>
+                <w:rPr>
+                  <w:rStyle w:val="Hyperlink"/>
+                  <w:color w:val="0066CC"/>
+                  <w:u w:val="single"/>
+                </w:rPr>
+                <w:t xml:space="preserve">Lecture slide</w:t>
+              </w:r>
+            </w:hyperlink>
+            <w:r>
+              <w:t xml:space="preserve"/>
+              <w:br/>
+              <w:t xml:space="preserve">→ Read the textbook: Ch 8 (Due: 3/16 11:59 pm)</w:t>
+              <w:br/>
+              <w:t xml:space="preserve">→ Ch 8 Watch It Video: Why Microsoft Uses Virtual Reality Headsets To Train Workers</w:t>
+            </w:r>
+            <w:r>
+              <w:t xml:space="preserve"> </w:t>
+            </w:r>
             <w:hyperlink r:id="rId90">
-              <w:r>
-                <w:rPr>
-                  <w:rStyle w:val="Hyperlink"/>
-                  <w:color w:val="0066CC"/>
-                  <w:u w:val="single"/>
-                </w:rPr>
-                <w:t xml:space="preserve">Lecture slide</w:t>
-              </w:r>
-            </w:hyperlink>
-            <w:r>
-              <w:t xml:space="preserve"/>
-              <w:br/>
-              <w:t xml:space="preserve">→ Read the textbook: Ch 8 (Due: 3/16 11:59 pm)</w:t>
-              <w:br/>
-              <w:t xml:space="preserve">→ Ch 8 Watch It Video: Why Microsoft Uses Virtual Reality Headsets To Train Workers</w:t>
-            </w:r>
-            <w:r>
-              <w:t xml:space="preserve"> </w:t>
-            </w:r>
-            <w:hyperlink r:id="rId91">
               <w:r>
                 <w:rPr>
                   <w:rStyle w:val="Hyperlink"/>
@@ -5835,64 +5745,64 @@
             <w:r>
               <w:t xml:space="preserve"> </w:t>
             </w:r>
+            <w:hyperlink r:id="rId91">
+              <w:r>
+                <w:rPr>
+                  <w:rStyle w:val="Hyperlink"/>
+                  <w:color w:val="0066CC"/>
+                  <w:u w:val="single"/>
+                </w:rPr>
+                <w:t xml:space="preserve">Link</w:t>
+              </w:r>
+            </w:hyperlink>
+            <w:r>
+              <w:t xml:space="preserve"> </w:t>
+            </w:r>
+            <w:r>
+              <w:t xml:space="preserve">[Slide]</w:t>
+              <w:br/>
+              <w:t xml:space="preserve">→ Presenters</w:t>
+            </w:r>
+            <w:r>
+              <w:t xml:space="preserve"> </w:t>
+            </w:r>
+            <w:hyperlink r:id="rId32">
+              <w:r>
+                <w:rPr>
+                  <w:rStyle w:val="Hyperlink"/>
+                  <w:color w:val="0066CC"/>
+                  <w:u w:val="single"/>
+                </w:rPr>
+                <w:t xml:space="preserve">Rubric</w:t>
+              </w:r>
+            </w:hyperlink>
+            <w:r>
+              <w:t xml:space="preserve">: Create a slide and prepare for a presentation (Due: Before class starts)</w:t>
+              <w:br/>
+              <w:t xml:space="preserve">→ Peer Assessment</w:t>
+            </w:r>
+            <w:r>
+              <w:t xml:space="preserve"> </w:t>
+            </w:r>
+            <w:hyperlink r:id="rId53">
+              <w:r>
+                <w:rPr>
+                  <w:rStyle w:val="Hyperlink"/>
+                  <w:color w:val="0066CC"/>
+                  <w:u w:val="single"/>
+                </w:rPr>
+                <w:t xml:space="preserve">Link</w:t>
+              </w:r>
+            </w:hyperlink>
+            <w:r>
+              <w:t xml:space="preserve"/>
+              <w:br/>
+              <w:t xml:space="preserve">→ Instructor Feedback Slides</w:t>
+            </w:r>
+            <w:r>
+              <w:t xml:space="preserve"> </w:t>
+            </w:r>
             <w:hyperlink r:id="rId92">
-              <w:r>
-                <w:rPr>
-                  <w:rStyle w:val="Hyperlink"/>
-                  <w:color w:val="0066CC"/>
-                  <w:u w:val="single"/>
-                </w:rPr>
-                <w:t xml:space="preserve">Link</w:t>
-              </w:r>
-            </w:hyperlink>
-            <w:r>
-              <w:t xml:space="preserve"> </w:t>
-            </w:r>
-            <w:r>
-              <w:t xml:space="preserve">[Slide]</w:t>
-              <w:br/>
-              <w:t xml:space="preserve">→ Presenters</w:t>
-            </w:r>
-            <w:r>
-              <w:t xml:space="preserve"> </w:t>
-            </w:r>
-            <w:hyperlink r:id="rId32">
-              <w:r>
-                <w:rPr>
-                  <w:rStyle w:val="Hyperlink"/>
-                  <w:color w:val="0066CC"/>
-                  <w:u w:val="single"/>
-                </w:rPr>
-                <w:t xml:space="preserve">Rubric</w:t>
-              </w:r>
-            </w:hyperlink>
-            <w:r>
-              <w:t xml:space="preserve">: Create a slide and prepare for a presentation (Due: Before class starts)</w:t>
-              <w:br/>
-              <w:t xml:space="preserve">→ Peer Assessment</w:t>
-            </w:r>
-            <w:r>
-              <w:t xml:space="preserve"> </w:t>
-            </w:r>
-            <w:hyperlink r:id="rId53">
-              <w:r>
-                <w:rPr>
-                  <w:rStyle w:val="Hyperlink"/>
-                  <w:color w:val="0066CC"/>
-                  <w:u w:val="single"/>
-                </w:rPr>
-                <w:t xml:space="preserve">Link</w:t>
-              </w:r>
-            </w:hyperlink>
-            <w:r>
-              <w:t xml:space="preserve"/>
-              <w:br/>
-              <w:t xml:space="preserve">→ Instructor Feedback Slides</w:t>
-            </w:r>
-            <w:r>
-              <w:t xml:space="preserve"> </w:t>
-            </w:r>
-            <w:hyperlink r:id="rId62">
               <w:r>
                 <w:rPr>
                   <w:rStyle w:val="Hyperlink"/>
@@ -6189,24 +6099,6 @@
             <w:r>
               <w:t xml:space="preserve"/>
               <w:br/>
-              <w:t xml:space="preserve">→ Instructor Feedback Slides</w:t>
-            </w:r>
-            <w:r>
-              <w:t xml:space="preserve"> </w:t>
-            </w:r>
-            <w:hyperlink r:id="rId62">
-              <w:r>
-                <w:rPr>
-                  <w:rStyle w:val="Hyperlink"/>
-                  <w:color w:val="0066CC"/>
-                  <w:u w:val="single"/>
-                </w:rPr>
-                <w:t xml:space="preserve">Link</w:t>
-              </w:r>
-            </w:hyperlink>
-            <w:r>
-              <w:t xml:space="preserve"/>
-              <w:br/>
               <w:br/>
               <w:t xml:space="preserve">→ Participate in class and report your activity</w:t>
             </w:r>
@@ -7303,24 +7195,6 @@
               <w:t xml:space="preserve"> </w:t>
             </w:r>
             <w:hyperlink r:id="rId53">
-              <w:r>
-                <w:rPr>
-                  <w:rStyle w:val="Hyperlink"/>
-                  <w:color w:val="0066CC"/>
-                  <w:u w:val="single"/>
-                </w:rPr>
-                <w:t xml:space="preserve">Link</w:t>
-              </w:r>
-            </w:hyperlink>
-            <w:r>
-              <w:t xml:space="preserve"/>
-              <w:br/>
-              <w:t xml:space="preserve">→ Instructor Feedback Slides</w:t>
-            </w:r>
-            <w:r>
-              <w:t xml:space="preserve"> </w:t>
-            </w:r>
-            <w:hyperlink r:id="rId62">
               <w:r>
                 <w:rPr>
                   <w:rStyle w:val="Hyperlink"/>
@@ -8432,7 +8306,7 @@
           <w:numId w:val="1011"/>
         </w:numPr>
       </w:pPr>
-      <w:hyperlink r:id="rId63">
+      <w:hyperlink r:id="rId62">
         <w:r>
           <w:rPr>
             <w:rStyle w:val="Hyperlink"/>
@@ -8456,7 +8330,7 @@
           <w:numId w:val="1011"/>
         </w:numPr>
       </w:pPr>
-      <w:hyperlink r:id="rId67">
+      <w:hyperlink r:id="rId66">
         <w:r>
           <w:rPr>
             <w:rStyle w:val="Hyperlink"/>
@@ -8480,7 +8354,7 @@
           <w:numId w:val="1011"/>
         </w:numPr>
       </w:pPr>
-      <w:hyperlink r:id="rId74">
+      <w:hyperlink r:id="rId73">
         <w:r>
           <w:rPr>
             <w:rStyle w:val="Hyperlink"/>
@@ -8504,7 +8378,7 @@
           <w:numId w:val="1011"/>
         </w:numPr>
       </w:pPr>
-      <w:hyperlink r:id="rId82">
+      <w:hyperlink r:id="rId81">
         <w:r>
           <w:rPr>
             <w:rStyle w:val="Hyperlink"/>
@@ -8528,7 +8402,7 @@
           <w:numId w:val="1011"/>
         </w:numPr>
       </w:pPr>
-      <w:hyperlink r:id="rId88">
+      <w:hyperlink r:id="rId87">
         <w:r>
           <w:rPr>
             <w:rStyle w:val="Hyperlink"/>

</xml_diff>

<commit_message>
Reorder 3/19: Activity before Team Meeting 8
Match Obsidian syllabus ordering.

Co-Authored-By: Claude Opus 4.6 (1M context) <noreply@anthropic.com>
</commit_message>
<xml_diff>
--- a/Syllabus.docx
+++ b/Syllabus.docx
@@ -5867,7 +5867,7 @@
                 <w:b/>
                 <w:bCs/>
               </w:rPr>
-              <w:t xml:space="preserve">Team Meeting 8</w:t>
+              <w:t xml:space="preserve">Activity: AI Training from Email Patterns</w:t>
             </w:r>
             <w:r>
               <w:t xml:space="preserve"> </w:t>
@@ -5879,34 +5879,11 @@
                   <w:color w:val="0066CC"/>
                   <w:u w:val="single"/>
                 </w:rPr>
-                <w:t xml:space="preserve">Team meeting 8 agenda</w:t>
+                <w:t xml:space="preserve">Instructions</w:t>
               </w:r>
             </w:hyperlink>
             <w:r>
               <w:t xml:space="preserve"/>
-              <w:br/>
-              <w:t xml:space="preserve">→ Notetakers only: Submit team meeting agenda (Due: 3/19 11:59 pm)</w:t>
-              <w:br/>
-              <w:t xml:space="preserve">→ Self and peer review evaluation 8</w:t>
-            </w:r>
-            <w:r>
-              <w:t xml:space="preserve"> </w:t>
-            </w:r>
-            <w:hyperlink r:id="rId53">
-              <w:r>
-                <w:rPr>
-                  <w:rStyle w:val="Hyperlink"/>
-                  <w:color w:val="0066CC"/>
-                  <w:u w:val="single"/>
-                </w:rPr>
-                <w:t xml:space="preserve">Link</w:t>
-              </w:r>
-            </w:hyperlink>
-            <w:r>
-              <w:t xml:space="preserve"> </w:t>
-            </w:r>
-            <w:r>
-              <w:t xml:space="preserve">(Due: 3/19 11:59 pm)</w:t>
               <w:br/>
               <w:br/>
             </w:r>
@@ -5915,7 +5892,7 @@
                 <w:b/>
                 <w:bCs/>
               </w:rPr>
-              <w:t xml:space="preserve">Activity: AI Training from Email Patterns</w:t>
+              <w:t xml:space="preserve">Team Meeting 8</w:t>
             </w:r>
             <w:r>
               <w:t xml:space="preserve"> </w:t>
@@ -5927,11 +5904,34 @@
                   <w:color w:val="0066CC"/>
                   <w:u w:val="single"/>
                 </w:rPr>
-                <w:t xml:space="preserve">Instructions</w:t>
+                <w:t xml:space="preserve">Team meeting 8 agenda</w:t>
               </w:r>
             </w:hyperlink>
             <w:r>
               <w:t xml:space="preserve"/>
+              <w:br/>
+              <w:t xml:space="preserve">→ Notetakers only: Submit team meeting agenda (Due: 3/19 11:59 pm)</w:t>
+              <w:br/>
+              <w:t xml:space="preserve">→ Self and peer review evaluation 8</w:t>
+            </w:r>
+            <w:r>
+              <w:t xml:space="preserve"> </w:t>
+            </w:r>
+            <w:hyperlink r:id="rId53">
+              <w:r>
+                <w:rPr>
+                  <w:rStyle w:val="Hyperlink"/>
+                  <w:color w:val="0066CC"/>
+                  <w:u w:val="single"/>
+                </w:rPr>
+                <w:t xml:space="preserve">Link</w:t>
+              </w:r>
+            </w:hyperlink>
+            <w:r>
+              <w:t xml:space="preserve"> </w:t>
+            </w:r>
+            <w:r>
+              <w:t xml:space="preserve">(Due: 3/19 11:59 pm)</w:t>
               <w:br/>
               <w:br/>
               <w:t xml:space="preserve">→ Participate in class and report your activity</w:t>
@@ -8426,7 +8426,7 @@
           <w:numId w:val="1011"/>
         </w:numPr>
       </w:pPr>
-      <w:hyperlink r:id="rId93">
+      <w:hyperlink r:id="rId94">
         <w:r>
           <w:rPr>
             <w:rStyle w:val="Hyperlink"/>

</xml_diff>